<commit_message>
docs: rebuild handover docx/pdf packages
</commit_message>
<xml_diff>
--- a/docs/WhaleDiveCentre-Admin-Menu-Simple-2026-07-12.docx
+++ b/docs/WhaleDiveCentre-Admin-Menu-Simple-2026-07-12.docx
@@ -4,56 +4,51 @@
   <w:body>
     <w:p>
       <w:pPr>
-        <w:jc w:val="center"/>
+        <w:pStyle w:val="Title"/>
+        <w:jc w:val="left"/>
       </w:pPr>
       <w:r>
-        <w:rPr>
-          <w:rFonts w:ascii="Calibri" w:hAnsi="Calibri" w:eastAsia="Calibri"/>
-          <w:b/>
-          <w:color w:val="004A98"/>
-          <w:sz w:val="40"/>
-        </w:rPr>
-        <w:t>Whale Dive Centre</w:t>
-      </w:r>
-    </w:p>
-    <w:p>
-      <w:pPr>
-        <w:jc w:val="center"/>
-      </w:pPr>
-      <w:r>
-        <w:rPr>
-          <w:rFonts w:ascii="Calibri" w:hAnsi="Calibri" w:eastAsia="Calibri"/>
-          <w:b/>
-          <w:color w:val="004A98"/>
-          <w:sz w:val="28"/>
-        </w:rPr>
-        <w:t>Panduan Menu Admin (Simple, Lengkap)</w:t>
-      </w:r>
-    </w:p>
-    <w:p>
-      <w:pPr>
-        <w:jc w:val="center"/>
-      </w:pPr>
-      <w:r>
-        <w:rPr>
-          <w:rFonts w:ascii="Calibri" w:hAnsi="Calibri" w:eastAsia="Calibri"/>
-          <w:b w:val="0"/>
-          <w:color w:val="5A646E"/>
-          <w:sz w:val="20"/>
-        </w:rPr>
-        <w:t>12 Juli 2026  ·  https://whaledivecentre.com</w:t>
-        <w:br/>
-        <w:t>Semua menu custom WP admin: Courses, Equipment, Info, Cerita, WDC Site, WDC Members</w:t>
+        <w:t>Whale Dive Centre — Panduan Menu Admin (Simple, Lengkap)</w:t>
       </w:r>
     </w:p>
     <w:p>
       <w:r>
         <w:rPr>
-          <w:rFonts w:ascii="Calibri" w:hAnsi="Calibri" w:eastAsia="Calibri"/>
           <w:b/>
-          <w:color w:val="004A98"/>
-          <w:sz w:val="26"/>
         </w:rPr>
+        <w:t>Tanggal:</w:t>
+      </w:r>
+      <w:r>
+        <w:t xml:space="preserve"> 12 Juli 2026 (update lanjutan)  </w:t>
+      </w:r>
+    </w:p>
+    <w:p>
+      <w:r>
+        <w:rPr>
+          <w:b/>
+        </w:rPr>
+        <w:t>Website:</w:t>
+      </w:r>
+      <w:r>
+        <w:t xml:space="preserve"> https://whaledivecentre.com  </w:t>
+      </w:r>
+    </w:p>
+    <w:p>
+      <w:r>
+        <w:rPr>
+          <w:b/>
+        </w:rPr>
+        <w:t>Isi:</w:t>
+      </w:r>
+      <w:r>
+        <w:t xml:space="preserve"> semua menu custom WP admin + fungsi + cara pakai (termasuk Courses, Equipment, Menus/Links, Partners media).</w:t>
+      </w:r>
+    </w:p>
+    <w:p>
+      <w:pPr>
+        <w:pStyle w:val="Heading1"/>
+      </w:pPr>
+      <w:r>
         <w:t>Cara kerja singkat</w:t>
       </w:r>
     </w:p>
@@ -62,11 +57,6 @@
         <w:pStyle w:val="ListNumber"/>
       </w:pPr>
       <w:r>
-        <w:rPr>
-          <w:rFonts w:ascii="Calibri" w:hAnsi="Calibri" w:eastAsia="Calibri"/>
-          <w:b w:val="0"/>
-          <w:sz w:val="22"/>
-        </w:rPr>
         <w:t>Login admin: https://whaledivecentre.com/wp-admin</w:t>
       </w:r>
     </w:p>
@@ -75,11 +65,6 @@
         <w:pStyle w:val="ListNumber"/>
       </w:pPr>
       <w:r>
-        <w:rPr>
-          <w:rFonts w:ascii="Calibri" w:hAnsi="Calibri" w:eastAsia="Calibri"/>
-          <w:b w:val="0"/>
-          <w:sz w:val="22"/>
-        </w:rPr>
         <w:t>Pilih menu kiri sesuai kebutuhan (Courses / Equipment / WDC Site / WDC Members / dll).</w:t>
       </w:r>
     </w:p>
@@ -88,11 +73,6 @@
         <w:pStyle w:val="ListNumber"/>
       </w:pPr>
       <w:r>
-        <w:rPr>
-          <w:rFonts w:ascii="Calibri" w:hAnsi="Calibri" w:eastAsia="Calibri"/>
-          <w:b w:val="0"/>
-          <w:sz w:val="22"/>
-        </w:rPr>
         <w:t>Edit field / status → Save / Update / Publish.</w:t>
       </w:r>
     </w:p>
@@ -101,2078 +81,1270 @@
         <w:pStyle w:val="ListNumber"/>
       </w:pPr>
       <w:r>
-        <w:rPr>
-          <w:rFonts w:ascii="Calibri" w:hAnsi="Calibri" w:eastAsia="Calibri"/>
-          <w:b w:val="0"/>
-          <w:sz w:val="22"/>
-        </w:rPr>
         <w:t>Buka website → Ctrl+F5 (cache LiteSpeed bisa nahan tampilan lama).</w:t>
       </w:r>
     </w:p>
     <w:p>
+      <w:pPr>
+        <w:pStyle w:val="Heading1"/>
+      </w:pPr>
       <w:r>
-        <w:rPr>
-          <w:rFonts w:ascii="Calibri" w:hAnsi="Calibri" w:eastAsia="Calibri"/>
-          <w:b/>
-          <w:color w:val="004A98"/>
-          <w:sz w:val="24"/>
-        </w:rPr>
         <w:t>1. Courses — katalog kursus</w:t>
       </w:r>
     </w:p>
     <w:p>
       <w:r>
-        <w:rPr>
-          <w:rFonts w:ascii="Calibri" w:hAnsi="Calibri" w:eastAsia="Calibri"/>
-          <w:b w:val="0"/>
-          <w:color w:val="5A646E"/>
-          <w:sz w:val="18"/>
-        </w:rPr>
         <w:t>Menu kiri: Courses. CPT: Dive Courses (wm_course). Tampil di /courses/.</w:t>
       </w:r>
     </w:p>
-    <w:tbl>
-      <w:tblPr>
-        <w:tblStyle w:val="TableGrid"/>
-        <w:tblW w:type="auto" w:w="0"/>
-        <w:tblLook w:firstColumn="1" w:firstRow="1" w:lastColumn="0" w:lastRow="0" w:noHBand="0" w:noVBand="1" w:val="04A0"/>
-      </w:tblPr>
-      <w:tblGrid>
-        <w:gridCol w:w="3456"/>
-        <w:gridCol w:w="3456"/>
-        <w:gridCol w:w="3456"/>
-      </w:tblGrid>
-      <w:tr>
-        <w:tc>
-          <w:tcPr>
-            <w:tcW w:type="dxa" w:w="3456"/>
-          </w:tcPr>
-          <w:p>
-            <w:r>
-              <w:t>Menu</w:t>
-            </w:r>
-          </w:p>
-        </w:tc>
-        <w:tc>
-          <w:tcPr>
-            <w:tcW w:type="dxa" w:w="3456"/>
-          </w:tcPr>
-          <w:p>
-            <w:r>
-              <w:t>Fungsi</w:t>
-            </w:r>
-          </w:p>
-        </w:tc>
-        <w:tc>
-          <w:tcPr>
-            <w:tcW w:type="dxa" w:w="3456"/>
-          </w:tcPr>
-          <w:p>
-            <w:r>
-              <w:t>Cara pakai</w:t>
-            </w:r>
-          </w:p>
-        </w:tc>
-      </w:tr>
-      <w:tr>
-        <w:tc>
-          <w:tcPr>
-            <w:tcW w:type="dxa" w:w="3456"/>
-          </w:tcPr>
-          <w:p>
-            <w:r>
-              <w:t>All Courses / Courses</w:t>
-            </w:r>
-          </w:p>
-        </w:tc>
-        <w:tc>
-          <w:tcPr>
-            <w:tcW w:type="dxa" w:w="3456"/>
-          </w:tcPr>
-          <w:p>
-            <w:r>
-              <w:t>Daftar semua kursus di website.</w:t>
-            </w:r>
-          </w:p>
-        </w:tc>
-        <w:tc>
-          <w:tcPr>
-            <w:tcW w:type="dxa" w:w="3456"/>
-          </w:tcPr>
-          <w:p>
-            <w:r>
-              <w:t>Courses → All Courses. Klik judul untuk edit. Status Publish = aktif.</w:t>
-            </w:r>
-          </w:p>
-        </w:tc>
-      </w:tr>
-      <w:tr>
-        <w:tc>
-          <w:tcPr>
-            <w:tcW w:type="dxa" w:w="3456"/>
-          </w:tcPr>
-          <w:p>
-            <w:r>
-              <w:t>Add New Course</w:t>
-            </w:r>
-          </w:p>
-        </w:tc>
-        <w:tc>
-          <w:tcPr>
-            <w:tcW w:type="dxa" w:w="3456"/>
-          </w:tcPr>
-          <w:p>
-            <w:r>
-              <w:t>Tambah kursus baru.</w:t>
-            </w:r>
-          </w:p>
-        </w:tc>
-        <w:tc>
-          <w:tcPr>
-            <w:tcW w:type="dxa" w:w="3456"/>
-          </w:tcPr>
-          <w:p>
-            <w:r>
-              <w:t>Courses → Add New. Isi Title, Excerpt, Content, Featured Image. Isi box Course Details. Publish.</w:t>
-            </w:r>
-          </w:p>
-        </w:tc>
-      </w:tr>
-      <w:tr>
-        <w:tc>
-          <w:tcPr>
-            <w:tcW w:type="dxa" w:w="3456"/>
-          </w:tcPr>
-          <w:p>
-            <w:r>
-              <w:t>Course Details (box di edit course)</w:t>
-            </w:r>
-          </w:p>
-        </w:tc>
-        <w:tc>
-          <w:tcPr>
-            <w:tcW w:type="dxa" w:w="3456"/>
-          </w:tcPr>
-          <w:p>
-            <w:r>
-              <w:t>Harga, durasi, kuota, prasyarat, include, highlight, CTA, tampil di katalog.</w:t>
-            </w:r>
-          </w:p>
-        </w:tc>
-        <w:tc>
-          <w:tcPr>
-            <w:tcW w:type="dxa" w:w="3456"/>
-          </w:tcPr>
-          <w:p>
-            <w:r>
-              <w:t>Isi Price (IDR), Duration, Max Students, Prerequisites, What's Included. Optional: Highlight 1–3, CTA Label. Centang “Show in public/member course catalog”. Centang “Price is estimate / starting price” bila “Harga mulai”. Update.</w:t>
-            </w:r>
-          </w:p>
-        </w:tc>
-      </w:tr>
-      <w:tr>
-        <w:tc>
-          <w:tcPr>
-            <w:tcW w:type="dxa" w:w="3456"/>
-          </w:tcPr>
-          <w:p>
-            <w:r>
-              <w:t>Course Levels</w:t>
-            </w:r>
-          </w:p>
-        </w:tc>
-        <w:tc>
-          <w:tcPr>
-            <w:tcW w:type="dxa" w:w="3456"/>
-          </w:tcPr>
-          <w:p>
-            <w:r>
-              <w:t>Level/filter kursus (badge di katalog).</w:t>
-            </w:r>
-          </w:p>
-        </w:tc>
-        <w:tc>
-          <w:tcPr>
-            <w:tcW w:type="dxa" w:w="3456"/>
-          </w:tcPr>
-          <w:p>
-            <w:r>
-              <w:t>Di sidebar edit course, atau taxonomy Course Levels. Pilih/assign level → Update.</w:t>
-            </w:r>
-          </w:p>
-        </w:tc>
-      </w:tr>
-      <w:tr>
-        <w:tc>
-          <w:tcPr>
-            <w:tcW w:type="dxa" w:w="3456"/>
-          </w:tcPr>
-          <w:p>
-            <w:r>
-              <w:t>Course Agencies / Agencies</w:t>
-            </w:r>
-          </w:p>
-        </w:tc>
-        <w:tc>
-          <w:tcPr>
-            <w:tcW w:type="dxa" w:w="3456"/>
-          </w:tcPr>
-          <w:p>
-            <w:r>
-              <w:t>Agensi kursus (NAUI, TDI, dll) untuk badge/filter.</w:t>
-            </w:r>
-          </w:p>
-        </w:tc>
-        <w:tc>
-          <w:tcPr>
-            <w:tcW w:type="dxa" w:w="3456"/>
-          </w:tcPr>
-          <w:p>
-            <w:r>
-              <w:t>Assign agency di panel course → Update.</w:t>
-            </w:r>
-          </w:p>
-        </w:tc>
-      </w:tr>
-      <w:tr>
-        <w:tc>
-          <w:tcPr>
-            <w:tcW w:type="dxa" w:w="3456"/>
-          </w:tcPr>
-          <w:p>
-            <w:r>
-              <w:t>Featured Image</w:t>
-            </w:r>
-          </w:p>
-        </w:tc>
-        <w:tc>
-          <w:tcPr>
-            <w:tcW w:type="dxa" w:w="3456"/>
-          </w:tcPr>
-          <w:p>
-            <w:r>
-              <w:t>Foto card &amp; single course.</w:t>
-            </w:r>
-          </w:p>
-        </w:tc>
-        <w:tc>
-          <w:tcPr>
-            <w:tcW w:type="dxa" w:w="3456"/>
-          </w:tcPr>
-          <w:p>
-            <w:r>
-              <w:t>Set Featured Image di edit course. Kosong = fallback tema.</w:t>
-            </w:r>
-          </w:p>
-        </w:tc>
-      </w:tr>
-    </w:tbl>
-    <w:p/>
     <w:p>
+      <w:pPr>
+        <w:pStyle w:val="ListBullet"/>
+      </w:pPr>
       <w:r>
         <w:rPr>
-          <w:rFonts w:ascii="Calibri" w:hAnsi="Calibri" w:eastAsia="Calibri"/>
           <w:b/>
-          <w:color w:val="004A98"/>
-          <w:sz w:val="24"/>
         </w:rPr>
+        <w:t>All Courses / Courses</w:t>
+      </w:r>
+      <w:r>
+        <w:t xml:space="preserve"> — daftar semua kursus. Edit judul, status Publish = aktif.</w:t>
+      </w:r>
+    </w:p>
+    <w:p>
+      <w:pPr>
+        <w:pStyle w:val="ListBullet"/>
+      </w:pPr>
+      <w:r>
+        <w:rPr>
+          <w:b/>
+        </w:rPr>
+        <w:t>Add New Course</w:t>
+      </w:r>
+      <w:r>
+        <w:t xml:space="preserve"> — tambah kursus baru. Isi Title, Excerpt, Content, Featured Image + Course Details.</w:t>
+      </w:r>
+    </w:p>
+    <w:p>
+      <w:pPr>
+        <w:pStyle w:val="ListBullet"/>
+      </w:pPr>
+      <w:r>
+        <w:rPr>
+          <w:b/>
+        </w:rPr>
+        <w:t>Course Details</w:t>
+      </w:r>
+      <w:r>
+        <w:t xml:space="preserve"> — Price (IDR), Duration, Max Students, Prerequisites, What's Included, Highlight 1–3, CTA Label. Centang show in catalog + estimate bila “Harga mulai”.</w:t>
+      </w:r>
+    </w:p>
+    <w:p>
+      <w:pPr>
+        <w:pStyle w:val="ListBullet"/>
+      </w:pPr>
+      <w:r>
+        <w:rPr>
+          <w:b/>
+        </w:rPr>
+        <w:t>Course Levels / Agencies</w:t>
+      </w:r>
+      <w:r>
+        <w:t xml:space="preserve"> — badge/filter.</w:t>
+      </w:r>
+    </w:p>
+    <w:p>
+      <w:pPr>
+        <w:pStyle w:val="ListBullet"/>
+      </w:pPr>
+      <w:r>
+        <w:rPr>
+          <w:b/>
+        </w:rPr>
+        <w:t>Featured Image</w:t>
+      </w:r>
+      <w:r>
+        <w:t xml:space="preserve"> — foto card &amp; single.</w:t>
+      </w:r>
+    </w:p>
+    <w:p>
+      <w:pPr>
+        <w:pStyle w:val="Heading1"/>
+      </w:pPr>
+      <w:r>
         <w:t>2. Equipment — katalog peralatan</w:t>
       </w:r>
     </w:p>
     <w:p>
       <w:r>
-        <w:rPr>
-          <w:rFonts w:ascii="Calibri" w:hAnsi="Calibri" w:eastAsia="Calibri"/>
-          <w:b w:val="0"/>
-          <w:color w:val="5A646E"/>
-          <w:sz w:val="18"/>
-        </w:rPr>
         <w:t>Menu kiri: Equipment. CPT: Dive Equipment (wm_equipment). Tampil di /equipment/.</w:t>
       </w:r>
     </w:p>
-    <w:tbl>
-      <w:tblPr>
-        <w:tblStyle w:val="TableGrid"/>
-        <w:tblW w:type="auto" w:w="0"/>
-        <w:tblLook w:firstColumn="1" w:firstRow="1" w:lastColumn="0" w:lastRow="0" w:noHBand="0" w:noVBand="1" w:val="04A0"/>
-      </w:tblPr>
-      <w:tblGrid>
-        <w:gridCol w:w="3456"/>
-        <w:gridCol w:w="3456"/>
-        <w:gridCol w:w="3456"/>
-      </w:tblGrid>
-      <w:tr>
-        <w:tc>
-          <w:tcPr>
-            <w:tcW w:type="dxa" w:w="3456"/>
-          </w:tcPr>
-          <w:p>
-            <w:r>
-              <w:t>Menu</w:t>
-            </w:r>
-          </w:p>
-        </w:tc>
-        <w:tc>
-          <w:tcPr>
-            <w:tcW w:type="dxa" w:w="3456"/>
-          </w:tcPr>
-          <w:p>
-            <w:r>
-              <w:t>Fungsi</w:t>
-            </w:r>
-          </w:p>
-        </w:tc>
-        <w:tc>
-          <w:tcPr>
-            <w:tcW w:type="dxa" w:w="3456"/>
-          </w:tcPr>
-          <w:p>
-            <w:r>
-              <w:t>Cara pakai</w:t>
-            </w:r>
-          </w:p>
-        </w:tc>
-      </w:tr>
-      <w:tr>
-        <w:tc>
-          <w:tcPr>
-            <w:tcW w:type="dxa" w:w="3456"/>
-          </w:tcPr>
-          <w:p>
-            <w:r>
-              <w:t>All Equipment / Equipment</w:t>
-            </w:r>
-          </w:p>
-        </w:tc>
-        <w:tc>
-          <w:tcPr>
-            <w:tcW w:type="dxa" w:w="3456"/>
-          </w:tcPr>
-          <w:p>
-            <w:r>
-              <w:t>Daftar semua gear di website.</w:t>
-            </w:r>
-          </w:p>
-        </w:tc>
-        <w:tc>
-          <w:tcPr>
-            <w:tcW w:type="dxa" w:w="3456"/>
-          </w:tcPr>
-          <w:p>
-            <w:r>
-              <w:t>Equipment → All Equipment. Klik item untuk edit. Publish = aktif.</w:t>
-            </w:r>
-          </w:p>
-        </w:tc>
-      </w:tr>
-      <w:tr>
-        <w:tc>
-          <w:tcPr>
-            <w:tcW w:type="dxa" w:w="3456"/>
-          </w:tcPr>
-          <w:p>
-            <w:r>
-              <w:t>Add New Equipment</w:t>
-            </w:r>
-          </w:p>
-        </w:tc>
-        <w:tc>
-          <w:tcPr>
-            <w:tcW w:type="dxa" w:w="3456"/>
-          </w:tcPr>
-          <w:p>
-            <w:r>
-              <w:t>Tambah item gear baru.</w:t>
-            </w:r>
-          </w:p>
-        </w:tc>
-        <w:tc>
-          <w:tcPr>
-            <w:tcW w:type="dxa" w:w="3456"/>
-          </w:tcPr>
-          <w:p>
-            <w:r>
-              <w:t>Equipment → Add New. Isi Title, Excerpt, Content, Featured Image. Isi box Equipment Details. Publish.</w:t>
-            </w:r>
-          </w:p>
-        </w:tc>
-      </w:tr>
-      <w:tr>
-        <w:tc>
-          <w:tcPr>
-            <w:tcW w:type="dxa" w:w="3456"/>
-          </w:tcPr>
-          <w:p>
-            <w:r>
-              <w:t>Equipment Details (box di edit gear)</w:t>
-            </w:r>
-          </w:p>
-        </w:tc>
-        <w:tc>
-          <w:tcPr>
-            <w:tcW w:type="dxa" w:w="3456"/>
-          </w:tcPr>
-          <w:p>
-            <w:r>
-              <w:t>Harga, stok, size/varian, fit note, service points, CTA, tampil katalog.</w:t>
-            </w:r>
-          </w:p>
-        </w:tc>
-        <w:tc>
-          <w:tcPr>
-            <w:tcW w:type="dxa" w:w="3456"/>
-          </w:tcPr>
-          <w:p>
-            <w:r>
-              <w:t>Isi Price (IDR), Stock, Sizes/Variants, Fit/Usage Note. Optional Service Point 1–3 + CTA Label. Centang show in catalog + estimate bila perlu. Update.</w:t>
-            </w:r>
-          </w:p>
-        </w:tc>
-      </w:tr>
-      <w:tr>
-        <w:tc>
-          <w:tcPr>
-            <w:tcW w:type="dxa" w:w="3456"/>
-          </w:tcPr>
-          <w:p>
-            <w:r>
-              <w:t>Gear Categories / Equipment Categories</w:t>
-            </w:r>
-          </w:p>
-        </w:tc>
-        <w:tc>
-          <w:tcPr>
-            <w:tcW w:type="dxa" w:w="3456"/>
-          </w:tcPr>
-          <w:p>
-            <w:r>
-              <w:t>Kategori gear untuk filter/badge.</w:t>
-            </w:r>
-          </w:p>
-        </w:tc>
-        <w:tc>
-          <w:tcPr>
-            <w:tcW w:type="dxa" w:w="3456"/>
-          </w:tcPr>
-          <w:p>
-            <w:r>
-              <w:t>Assign category di panel equipment → Update.</w:t>
-            </w:r>
-          </w:p>
-        </w:tc>
-      </w:tr>
-      <w:tr>
-        <w:tc>
-          <w:tcPr>
-            <w:tcW w:type="dxa" w:w="3456"/>
-          </w:tcPr>
-          <w:p>
-            <w:r>
-              <w:t>Brands / Equipment Brands</w:t>
-            </w:r>
-          </w:p>
-        </w:tc>
-        <w:tc>
-          <w:tcPr>
-            <w:tcW w:type="dxa" w:w="3456"/>
-          </w:tcPr>
-          <w:p>
-            <w:r>
-              <w:t>Brand gear untuk filter/badge.</w:t>
-            </w:r>
-          </w:p>
-        </w:tc>
-        <w:tc>
-          <w:tcPr>
-            <w:tcW w:type="dxa" w:w="3456"/>
-          </w:tcPr>
-          <w:p>
-            <w:r>
-              <w:t>Assign brand di panel equipment → Update.</w:t>
-            </w:r>
-          </w:p>
-        </w:tc>
-      </w:tr>
-      <w:tr>
-        <w:tc>
-          <w:tcPr>
-            <w:tcW w:type="dxa" w:w="3456"/>
-          </w:tcPr>
-          <w:p>
-            <w:r>
-              <w:t>Featured Image</w:t>
-            </w:r>
-          </w:p>
-        </w:tc>
-        <w:tc>
-          <w:tcPr>
-            <w:tcW w:type="dxa" w:w="3456"/>
-          </w:tcPr>
-          <w:p>
-            <w:r>
-              <w:t>Foto produk card &amp; single.</w:t>
-            </w:r>
-          </w:p>
-        </w:tc>
-        <w:tc>
-          <w:tcPr>
-            <w:tcW w:type="dxa" w:w="3456"/>
-          </w:tcPr>
-          <w:p>
-            <w:r>
-              <w:t>Set Featured Image di edit equipment.</w:t>
-            </w:r>
-          </w:p>
-        </w:tc>
-      </w:tr>
-    </w:tbl>
-    <w:p/>
     <w:p>
+      <w:pPr>
+        <w:pStyle w:val="ListBullet"/>
+      </w:pPr>
       <w:r>
         <w:rPr>
-          <w:rFonts w:ascii="Calibri" w:hAnsi="Calibri" w:eastAsia="Calibri"/>
           <w:b/>
-          <w:color w:val="004A98"/>
-          <w:sz w:val="24"/>
         </w:rPr>
+        <w:t>All Equipment</w:t>
+      </w:r>
+      <w:r>
+        <w:t xml:space="preserve"> — list gear. Publish = aktif.</w:t>
+      </w:r>
+    </w:p>
+    <w:p>
+      <w:pPr>
+        <w:pStyle w:val="ListBullet"/>
+      </w:pPr>
+      <w:r>
+        <w:rPr>
+          <w:b/>
+        </w:rPr>
+        <w:t>Add New Equipment</w:t>
+      </w:r>
+      <w:r>
+        <w:t xml:space="preserve"> — Title, Excerpt, Content, Featured Image + Equipment Details.</w:t>
+      </w:r>
+    </w:p>
+    <w:p>
+      <w:pPr>
+        <w:pStyle w:val="ListBullet"/>
+      </w:pPr>
+      <w:r>
+        <w:rPr>
+          <w:b/>
+        </w:rPr>
+        <w:t>Equipment Details</w:t>
+      </w:r>
+      <w:r>
+        <w:t xml:space="preserve"> — Price, Stock, Sizes/Variants, Fit note, Service Point, CTA, show catalog.</w:t>
+      </w:r>
+    </w:p>
+    <w:p>
+      <w:pPr>
+        <w:pStyle w:val="ListBullet"/>
+      </w:pPr>
+      <w:r>
+        <w:rPr>
+          <w:b/>
+        </w:rPr>
+        <w:t>Categories / Brands</w:t>
+      </w:r>
+      <w:r>
+        <w:t xml:space="preserve"> — filter/badge.</w:t>
+      </w:r>
+    </w:p>
+    <w:p>
+      <w:pPr>
+        <w:pStyle w:val="ListBullet"/>
+      </w:pPr>
+      <w:r>
+        <w:rPr>
+          <w:b/>
+        </w:rPr>
+        <w:t>Featured Image</w:t>
+      </w:r>
+      <w:r>
+        <w:t xml:space="preserve"> — foto produk.</w:t>
+      </w:r>
+    </w:p>
+    <w:p>
+      <w:pPr>
+        <w:pStyle w:val="Heading1"/>
+      </w:pPr>
+      <w:r>
         <w:t>3. Informasi — info / giveaway / event</w:t>
       </w:r>
     </w:p>
     <w:p>
       <w:r>
-        <w:rPr>
-          <w:rFonts w:ascii="Calibri" w:hAnsi="Calibri" w:eastAsia="Calibri"/>
-          <w:b w:val="0"/>
-          <w:color w:val="5A646E"/>
-          <w:sz w:val="18"/>
-        </w:rPr>
-        <w:t>Menu kiri: Informasi (wdc_info). Konten info member/public (termasuk giveaway copy).</w:t>
+        <w:t>Menu kiri: Informasi (wdc_info).</w:t>
       </w:r>
     </w:p>
-    <w:tbl>
-      <w:tblPr>
-        <w:tblStyle w:val="TableGrid"/>
-        <w:tblW w:type="auto" w:w="0"/>
-        <w:tblLook w:firstColumn="1" w:firstRow="1" w:lastColumn="0" w:lastRow="0" w:noHBand="0" w:noVBand="1" w:val="04A0"/>
-      </w:tblPr>
-      <w:tblGrid>
-        <w:gridCol w:w="3456"/>
-        <w:gridCol w:w="3456"/>
-        <w:gridCol w:w="3456"/>
-      </w:tblGrid>
-      <w:tr>
-        <w:tc>
-          <w:tcPr>
-            <w:tcW w:type="dxa" w:w="3456"/>
-          </w:tcPr>
-          <w:p>
-            <w:r>
-              <w:t>Menu</w:t>
-            </w:r>
-          </w:p>
-        </w:tc>
-        <w:tc>
-          <w:tcPr>
-            <w:tcW w:type="dxa" w:w="3456"/>
-          </w:tcPr>
-          <w:p>
-            <w:r>
-              <w:t>Fungsi</w:t>
-            </w:r>
-          </w:p>
-        </w:tc>
-        <w:tc>
-          <w:tcPr>
-            <w:tcW w:type="dxa" w:w="3456"/>
-          </w:tcPr>
-          <w:p>
-            <w:r>
-              <w:t>Cara pakai</w:t>
-            </w:r>
-          </w:p>
-        </w:tc>
-      </w:tr>
-      <w:tr>
-        <w:tc>
-          <w:tcPr>
-            <w:tcW w:type="dxa" w:w="3456"/>
-          </w:tcPr>
-          <w:p>
-            <w:r>
-              <w:t>Semua Informasi</w:t>
-            </w:r>
-          </w:p>
-        </w:tc>
-        <w:tc>
-          <w:tcPr>
-            <w:tcW w:type="dxa" w:w="3456"/>
-          </w:tcPr>
-          <w:p>
-            <w:r>
-              <w:t>List pengumuman/info/event/giveaway text.</w:t>
-            </w:r>
-          </w:p>
-        </w:tc>
-        <w:tc>
-          <w:tcPr>
-            <w:tcW w:type="dxa" w:w="3456"/>
-          </w:tcPr>
-          <w:p>
-            <w:r>
-              <w:t>Informasi → Semua Informasi → Edit / Add New → Publish.</w:t>
-            </w:r>
-          </w:p>
-        </w:tc>
-      </w:tr>
-      <w:tr>
-        <w:tc>
-          <w:tcPr>
-            <w:tcW w:type="dxa" w:w="3456"/>
-          </w:tcPr>
-          <w:p>
-            <w:r>
-              <w:t>Tipe Informasi</w:t>
-            </w:r>
-          </w:p>
-        </w:tc>
-        <w:tc>
-          <w:tcPr>
-            <w:tcW w:type="dxa" w:w="3456"/>
-          </w:tcPr>
-          <w:p>
-            <w:r>
-              <w:t>Kategori info (1st Giveaway, Event, Trip, Update NAUI/WDC/TDI/DAN, dll).</w:t>
-            </w:r>
-          </w:p>
-        </w:tc>
-        <w:tc>
-          <w:tcPr>
-            <w:tcW w:type="dxa" w:w="3456"/>
-          </w:tcPr>
-          <w:p>
-            <w:r>
-              <w:t>Assign tipe di edit info. Bisa tambah term baru di Tipe Informasi.</w:t>
-            </w:r>
-          </w:p>
-        </w:tc>
-      </w:tr>
-    </w:tbl>
-    <w:p/>
     <w:p>
+      <w:pPr>
+        <w:pStyle w:val="ListBullet"/>
+      </w:pPr>
       <w:r>
         <w:rPr>
-          <w:rFonts w:ascii="Calibri" w:hAnsi="Calibri" w:eastAsia="Calibri"/>
           <w:b/>
-          <w:color w:val="004A98"/>
-          <w:sz w:val="24"/>
         </w:rPr>
+        <w:t>Semua Informasi</w:t>
+      </w:r>
+      <w:r>
+        <w:t xml:space="preserve"> — list pengumuman/info/event/giveaway text.</w:t>
+      </w:r>
+    </w:p>
+    <w:p>
+      <w:pPr>
+        <w:pStyle w:val="ListBullet"/>
+      </w:pPr>
+      <w:r>
+        <w:rPr>
+          <w:b/>
+        </w:rPr>
+        <w:t>Tipe Informasi</w:t>
+      </w:r>
+      <w:r>
+        <w:t xml:space="preserve"> — kategori (1st Giveaway, Event, Trip, Update NAUI/WDC/TDI/DAN, dll).</w:t>
+      </w:r>
+    </w:p>
+    <w:p>
+      <w:pPr>
+        <w:pStyle w:val="Heading1"/>
+      </w:pPr>
+      <w:r>
         <w:t>4. Cerita Kamu — story member</w:t>
       </w:r>
     </w:p>
     <w:p>
       <w:r>
-        <w:rPr>
-          <w:rFonts w:ascii="Calibri" w:hAnsi="Calibri" w:eastAsia="Calibri"/>
-          <w:b w:val="0"/>
-          <w:color w:val="5A646E"/>
-          <w:sz w:val="18"/>
-        </w:rPr>
-        <w:t>Menu kiri: Cerita Kamu (wdc_story). Moderasi cerita member.</w:t>
+        <w:t>Menu kiri: Cerita Kamu (wdc_story).</w:t>
       </w:r>
     </w:p>
-    <w:tbl>
-      <w:tblPr>
-        <w:tblStyle w:val="TableGrid"/>
-        <w:tblW w:type="auto" w:w="0"/>
-        <w:tblLook w:firstColumn="1" w:firstRow="1" w:lastColumn="0" w:lastRow="0" w:noHBand="0" w:noVBand="1" w:val="04A0"/>
-      </w:tblPr>
-      <w:tblGrid>
-        <w:gridCol w:w="3456"/>
-        <w:gridCol w:w="3456"/>
-        <w:gridCol w:w="3456"/>
-      </w:tblGrid>
-      <w:tr>
-        <w:tc>
-          <w:tcPr>
-            <w:tcW w:type="dxa" w:w="3456"/>
-          </w:tcPr>
-          <w:p>
-            <w:r>
-              <w:t>Menu</w:t>
-            </w:r>
-          </w:p>
-        </w:tc>
-        <w:tc>
-          <w:tcPr>
-            <w:tcW w:type="dxa" w:w="3456"/>
-          </w:tcPr>
-          <w:p>
-            <w:r>
-              <w:t>Fungsi</w:t>
-            </w:r>
-          </w:p>
-        </w:tc>
-        <w:tc>
-          <w:tcPr>
-            <w:tcW w:type="dxa" w:w="3456"/>
-          </w:tcPr>
-          <w:p>
-            <w:r>
-              <w:t>Cara pakai</w:t>
-            </w:r>
-          </w:p>
-        </w:tc>
-      </w:tr>
-      <w:tr>
-        <w:tc>
-          <w:tcPr>
-            <w:tcW w:type="dxa" w:w="3456"/>
-          </w:tcPr>
-          <w:p>
-            <w:r>
-              <w:t>Semua Cerita</w:t>
-            </w:r>
-          </w:p>
-        </w:tc>
-        <w:tc>
-          <w:tcPr>
-            <w:tcW w:type="dxa" w:w="3456"/>
-          </w:tcPr>
-          <w:p>
-            <w:r>
-              <w:t>List cerita yang masuk/diinput.</w:t>
-            </w:r>
-          </w:p>
-        </w:tc>
-        <w:tc>
-          <w:tcPr>
-            <w:tcW w:type="dxa" w:w="3456"/>
-          </w:tcPr>
-          <w:p>
-            <w:r>
-              <w:t>Cerita Kamu → list → review isi &amp; foto.</w:t>
-            </w:r>
-          </w:p>
-        </w:tc>
-      </w:tr>
-      <w:tr>
-        <w:tc>
-          <w:tcPr>
-            <w:tcW w:type="dxa" w:w="3456"/>
-          </w:tcPr>
-          <w:p>
-            <w:r>
-              <w:t>Approval Status / Featured</w:t>
-            </w:r>
-          </w:p>
-        </w:tc>
-        <w:tc>
-          <w:tcPr>
-            <w:tcW w:type="dxa" w:w="3456"/>
-          </w:tcPr>
-          <w:p>
-            <w:r>
-              <w:t>Approve atau highlight cerita (bila field tersedia di edit).</w:t>
-            </w:r>
-          </w:p>
-        </w:tc>
-        <w:tc>
-          <w:tcPr>
-            <w:tcW w:type="dxa" w:w="3456"/>
-          </w:tcPr>
-          <w:p>
-            <w:r>
-              <w:t>Buka cerita → set status/featured sesuai box → Update.</w:t>
-            </w:r>
-          </w:p>
-        </w:tc>
-      </w:tr>
-      <w:tr>
-        <w:tc>
-          <w:tcPr>
-            <w:tcW w:type="dxa" w:w="3456"/>
-          </w:tcPr>
-          <w:p>
-            <w:r>
-              <w:t>Jenis Cerita</w:t>
-            </w:r>
-          </w:p>
-        </w:tc>
-        <w:tc>
-          <w:tcPr>
-            <w:tcW w:type="dxa" w:w="3456"/>
-          </w:tcPr>
-          <w:p>
-            <w:r>
-              <w:t>Klasifikasi jenis cerita.</w:t>
-            </w:r>
-          </w:p>
-        </w:tc>
-        <w:tc>
-          <w:tcPr>
-            <w:tcW w:type="dxa" w:w="3456"/>
-          </w:tcPr>
-          <w:p>
-            <w:r>
-              <w:t>Assign taxonomy Jenis Cerita → Update.</w:t>
-            </w:r>
-          </w:p>
-        </w:tc>
-      </w:tr>
-    </w:tbl>
-    <w:p/>
     <w:p>
+      <w:pPr>
+        <w:pStyle w:val="ListBullet"/>
+      </w:pPr>
       <w:r>
         <w:rPr>
-          <w:rFonts w:ascii="Calibri" w:hAnsi="Calibri" w:eastAsia="Calibri"/>
           <w:b/>
-          <w:color w:val="004A98"/>
-          <w:sz w:val="24"/>
         </w:rPr>
+        <w:t>Semua Cerita</w:t>
+      </w:r>
+      <w:r>
+        <w:t xml:space="preserve"> — review cerita + foto.</w:t>
+      </w:r>
+    </w:p>
+    <w:p>
+      <w:pPr>
+        <w:pStyle w:val="ListBullet"/>
+      </w:pPr>
+      <w:r>
+        <w:rPr>
+          <w:b/>
+        </w:rPr>
+        <w:t>Approval / Featured</w:t>
+      </w:r>
+      <w:r>
+        <w:t xml:space="preserve"> — set status/highlight bila field tersedia.</w:t>
+      </w:r>
+    </w:p>
+    <w:p>
+      <w:pPr>
+        <w:pStyle w:val="ListBullet"/>
+      </w:pPr>
+      <w:r>
+        <w:rPr>
+          <w:b/>
+        </w:rPr>
+        <w:t>Jenis Cerita</w:t>
+      </w:r>
+      <w:r>
+        <w:t xml:space="preserve"> — klasifikasi.</w:t>
+      </w:r>
+    </w:p>
+    <w:p>
+      <w:pPr>
+        <w:pStyle w:val="Heading1"/>
+      </w:pPr>
+      <w:r>
         <w:t>5. WDC Site — konten halaman public</w:t>
       </w:r>
     </w:p>
     <w:p>
       <w:r>
-        <w:rPr>
-          <w:rFonts w:ascii="Calibri" w:hAnsi="Calibri" w:eastAsia="Calibri"/>
-          <w:b w:val="0"/>
-          <w:color w:val="5A646E"/>
-          <w:sz w:val="18"/>
-        </w:rPr>
         <w:t>Menu kiri: WDC Site. Edit teks section website (bukan order).</w:t>
       </w:r>
     </w:p>
-    <w:tbl>
-      <w:tblPr>
-        <w:tblStyle w:val="TableGrid"/>
-        <w:tblW w:type="auto" w:w="0"/>
-        <w:tblLook w:firstColumn="1" w:firstRow="1" w:lastColumn="0" w:lastRow="0" w:noHBand="0" w:noVBand="1" w:val="04A0"/>
-      </w:tblPr>
-      <w:tblGrid>
-        <w:gridCol w:w="3456"/>
-        <w:gridCol w:w="3456"/>
-        <w:gridCol w:w="3456"/>
-      </w:tblGrid>
-      <w:tr>
-        <w:tc>
-          <w:tcPr>
-            <w:tcW w:type="dxa" w:w="3456"/>
-          </w:tcPr>
-          <w:p>
-            <w:r>
-              <w:t>Menu</w:t>
-            </w:r>
-          </w:p>
-        </w:tc>
-        <w:tc>
-          <w:tcPr>
-            <w:tcW w:type="dxa" w:w="3456"/>
-          </w:tcPr>
-          <w:p>
-            <w:r>
-              <w:t>Fungsi</w:t>
-            </w:r>
-          </w:p>
-        </w:tc>
-        <w:tc>
-          <w:tcPr>
-            <w:tcW w:type="dxa" w:w="3456"/>
-          </w:tcPr>
-          <w:p>
-            <w:r>
-              <w:t>Cara pakai</w:t>
-            </w:r>
-          </w:p>
-        </w:tc>
-      </w:tr>
-      <w:tr>
-        <w:tc>
-          <w:tcPr>
-            <w:tcW w:type="dxa" w:w="3456"/>
-          </w:tcPr>
-          <w:p>
-            <w:r>
-              <w:t>Contact &amp; Footer</w:t>
-            </w:r>
-          </w:p>
-        </w:tc>
-        <w:tc>
-          <w:tcPr>
-            <w:tcW w:type="dxa" w:w="3456"/>
-          </w:tcPr>
-          <w:p>
-            <w:r>
-              <w:t>Email, telepon/WA, alamat, Instagram, teks footer.</w:t>
-            </w:r>
-          </w:p>
-        </w:tc>
-        <w:tc>
-          <w:tcPr>
-            <w:tcW w:type="dxa" w:w="3456"/>
-          </w:tcPr>
-          <w:p>
-            <w:r>
-              <w:t>Isi field → Save Changes → cek website + Ctrl+F5.</w:t>
-            </w:r>
-          </w:p>
-        </w:tc>
-      </w:tr>
-      <w:tr>
-        <w:tc>
-          <w:tcPr>
-            <w:tcW w:type="dxa" w:w="3456"/>
-          </w:tcPr>
-          <w:p>
-            <w:r>
-              <w:t>Home Content</w:t>
-            </w:r>
-          </w:p>
-        </w:tc>
-        <w:tc>
-          <w:tcPr>
-            <w:tcW w:type="dxa" w:w="3456"/>
-          </w:tcPr>
-          <w:p>
-            <w:r>
-              <w:t>Hero/home headline &amp; copy utama.</w:t>
-            </w:r>
-          </w:p>
-        </w:tc>
-        <w:tc>
-          <w:tcPr>
-            <w:tcW w:type="dxa" w:w="3456"/>
-          </w:tcPr>
-          <w:p>
-            <w:r>
-              <w:t>Edit teks home → Save → cek beranda.</w:t>
-            </w:r>
-          </w:p>
-        </w:tc>
-      </w:tr>
-      <w:tr>
-        <w:tc>
-          <w:tcPr>
-            <w:tcW w:type="dxa" w:w="3456"/>
-          </w:tcPr>
-          <w:p>
-            <w:r>
-              <w:t>About Page</w:t>
-            </w:r>
-          </w:p>
-        </w:tc>
-        <w:tc>
-          <w:tcPr>
-            <w:tcW w:type="dxa" w:w="3456"/>
-          </w:tcPr>
-          <w:p>
-            <w:r>
-              <w:t>Teks halaman Tentang / values.</w:t>
-            </w:r>
-          </w:p>
-        </w:tc>
-        <w:tc>
-          <w:tcPr>
-            <w:tcW w:type="dxa" w:w="3456"/>
-          </w:tcPr>
-          <w:p>
-            <w:r>
-              <w:t>Edit About fields → Save → cek /about/.</w:t>
-            </w:r>
-          </w:p>
-        </w:tc>
-      </w:tr>
-      <w:tr>
-        <w:tc>
-          <w:tcPr>
-            <w:tcW w:type="dxa" w:w="3456"/>
-          </w:tcPr>
-          <w:p>
-            <w:r>
-              <w:t>Contact Page</w:t>
-            </w:r>
-          </w:p>
-        </w:tc>
-        <w:tc>
-          <w:tcPr>
-            <w:tcW w:type="dxa" w:w="3456"/>
-          </w:tcPr>
-          <w:p>
-            <w:r>
-              <w:t>Teks form contact, jam, Google Maps URL.</w:t>
-            </w:r>
-          </w:p>
-        </w:tc>
-        <w:tc>
-          <w:tcPr>
-            <w:tcW w:type="dxa" w:w="3456"/>
-          </w:tcPr>
-          <w:p>
-            <w:r>
-              <w:t>Edit → Save. Maps: https://maps.app.goo.gl/7A3Yo7gsaDCcS6xZ6</w:t>
-            </w:r>
-          </w:p>
-        </w:tc>
-      </w:tr>
-      <w:tr>
-        <w:tc>
-          <w:tcPr>
-            <w:tcW w:type="dxa" w:w="3456"/>
-          </w:tcPr>
-          <w:p>
-            <w:r>
-              <w:t>Courses &amp; Equipment CTA</w:t>
-            </w:r>
-          </w:p>
-        </w:tc>
-        <w:tc>
-          <w:tcPr>
-            <w:tcW w:type="dxa" w:w="3456"/>
-          </w:tcPr>
-          <w:p>
-            <w:r>
-              <w:t>Copy tombol/CTA di halaman courses &amp; equipment.</w:t>
-            </w:r>
-          </w:p>
-        </w:tc>
-        <w:tc>
-          <w:tcPr>
-            <w:tcW w:type="dxa" w:w="3456"/>
-          </w:tcPr>
-          <w:p>
-            <w:r>
-              <w:t>Ubah CTA → Save → cek /courses/ &amp; /equipment/.</w:t>
-            </w:r>
-          </w:p>
-        </w:tc>
-      </w:tr>
-      <w:tr>
-        <w:tc>
-          <w:tcPr>
-            <w:tcW w:type="dxa" w:w="3456"/>
-          </w:tcPr>
-          <w:p>
-            <w:r>
-              <w:t>Partners / Trust</w:t>
-            </w:r>
-          </w:p>
-        </w:tc>
-        <w:tc>
-          <w:tcPr>
-            <w:tcW w:type="dxa" w:w="3456"/>
-          </w:tcPr>
-          <w:p>
-            <w:r>
-              <w:t>Logo partner trust (NAUI, TDI, DAN, dll).</w:t>
-            </w:r>
-          </w:p>
-        </w:tc>
-        <w:tc>
-          <w:tcPr>
-            <w:tcW w:type="dxa" w:w="3456"/>
-          </w:tcPr>
-          <w:p>
-            <w:r>
-              <w:t>Update partner → Save → cek beranda.</w:t>
-            </w:r>
-          </w:p>
-        </w:tc>
-      </w:tr>
-      <w:tr>
-        <w:tc>
-          <w:tcPr>
-            <w:tcW w:type="dxa" w:w="3456"/>
-          </w:tcPr>
-          <w:p>
-            <w:r>
-              <w:t>Crew</w:t>
-            </w:r>
-          </w:p>
-        </w:tc>
-        <w:tc>
-          <w:tcPr>
-            <w:tcW w:type="dxa" w:w="3456"/>
-          </w:tcPr>
-          <w:p>
-            <w:r>
-              <w:t>Profil crew (nama, role, bio, foto).</w:t>
-            </w:r>
-          </w:p>
-        </w:tc>
-        <w:tc>
-          <w:tcPr>
-            <w:tcW w:type="dxa" w:w="3456"/>
-          </w:tcPr>
-          <w:p>
-            <w:r>
-              <w:t>WDC Site → Crew → Add New / Edit → Publish. (Add New di tombol list, bukan sidebar ekstra.)</w:t>
-            </w:r>
-          </w:p>
-        </w:tc>
-      </w:tr>
-      <w:tr>
-        <w:tc>
-          <w:tcPr>
-            <w:tcW w:type="dxa" w:w="3456"/>
-          </w:tcPr>
-          <w:p>
-            <w:r>
-              <w:t>Testimonials</w:t>
-            </w:r>
-          </w:p>
-        </w:tc>
-        <w:tc>
-          <w:tcPr>
-            <w:tcW w:type="dxa" w:w="3456"/>
-          </w:tcPr>
-          <w:p>
-            <w:r>
-              <w:t>Testimoni klien/member.</w:t>
-            </w:r>
-          </w:p>
-        </w:tc>
-        <w:tc>
-          <w:tcPr>
-            <w:tcW w:type="dxa" w:w="3456"/>
-          </w:tcPr>
-          <w:p>
-            <w:r>
-              <w:t>WDC Site → Testimonials → Add New / Edit → Publish.</w:t>
-            </w:r>
-          </w:p>
-        </w:tc>
-      </w:tr>
-    </w:tbl>
-    <w:p/>
+    <w:p>
+      <w:pPr>
+        <w:pStyle w:val="ListBullet"/>
+      </w:pPr>
+      <w:r>
+        <w:rPr>
+          <w:b/>
+        </w:rPr>
+        <w:t>Contact &amp; Footer</w:t>
+      </w:r>
+      <w:r>
+        <w:t xml:space="preserve"> — email, telepon/WA, alamat, jam, Instagram/Facebook/X, footer kicker/blurb/CTA.</w:t>
+      </w:r>
+    </w:p>
+    <w:p>
+      <w:pPr>
+        <w:pStyle w:val="ListBullet"/>
+      </w:pPr>
+      <w:r>
+        <w:rPr>
+          <w:b/>
+        </w:rPr>
+        <w:t>Menus / Links</w:t>
+      </w:r>
+      <w:r>
+        <w:t xml:space="preserve"> — </w:t>
+      </w:r>
+      <w:r>
+        <w:rPr>
+          <w:b/>
+        </w:rPr>
+        <w:t>(baru)</w:t>
+      </w:r>
+      <w:r>
+        <w:t xml:space="preserve"> navbar + footer Jelajahi/Kursus.</w:t>
+      </w:r>
+    </w:p>
+    <w:p>
+      <w:pPr>
+        <w:pStyle w:val="ListBullet"/>
+      </w:pPr>
+      <w:r>
+        <w:rPr>
+          <w:b/>
+        </w:rPr>
+        <w:t>Home Content</w:t>
+      </w:r>
+      <w:r>
+        <w:t xml:space="preserve"> — hero/home headline &amp; copy utama.</w:t>
+      </w:r>
+    </w:p>
+    <w:p>
+      <w:pPr>
+        <w:pStyle w:val="ListBullet"/>
+      </w:pPr>
+      <w:r>
+        <w:rPr>
+          <w:b/>
+        </w:rPr>
+        <w:t>About Page</w:t>
+      </w:r>
+      <w:r>
+        <w:t xml:space="preserve"> — teks Tentang / values.</w:t>
+      </w:r>
+    </w:p>
+    <w:p>
+      <w:pPr>
+        <w:pStyle w:val="ListBullet"/>
+      </w:pPr>
+      <w:r>
+        <w:rPr>
+          <w:b/>
+        </w:rPr>
+        <w:t>Contact Page</w:t>
+      </w:r>
+      <w:r>
+        <w:t xml:space="preserve"> — teks form contact + maps URL.</w:t>
+      </w:r>
+    </w:p>
+    <w:p>
+      <w:pPr>
+        <w:pStyle w:val="ListBullet"/>
+      </w:pPr>
+      <w:r>
+        <w:rPr>
+          <w:b/>
+        </w:rPr>
+        <w:t>Courses &amp; Equipment CTA</w:t>
+      </w:r>
+      <w:r>
+        <w:t xml:space="preserve"> — copy tombol/CTA di halaman courses &amp; equipment.</w:t>
+      </w:r>
+    </w:p>
+    <w:p>
+      <w:pPr>
+        <w:pStyle w:val="ListBullet"/>
+      </w:pPr>
+      <w:r>
+        <w:rPr>
+          <w:b/>
+        </w:rPr>
+        <w:t>Partners / Trust</w:t>
+      </w:r>
+      <w:r>
+        <w:t xml:space="preserve"> — logo partner trust (Media Library picker).</w:t>
+      </w:r>
+    </w:p>
+    <w:p>
+      <w:pPr>
+        <w:pStyle w:val="ListBullet"/>
+      </w:pPr>
+      <w:r>
+        <w:rPr>
+          <w:b/>
+        </w:rPr>
+        <w:t>Crew</w:t>
+      </w:r>
+      <w:r>
+        <w:t xml:space="preserve"> — profil crew (nama, role, bio, foto).</w:t>
+      </w:r>
+    </w:p>
+    <w:p>
+      <w:pPr>
+        <w:pStyle w:val="ListBullet"/>
+      </w:pPr>
+      <w:r>
+        <w:rPr>
+          <w:b/>
+        </w:rPr>
+        <w:t>Testimonials</w:t>
+      </w:r>
+      <w:r>
+        <w:t xml:space="preserve"> — testimoni klien/member.</w:t>
+      </w:r>
+    </w:p>
+    <w:p>
+      <w:pPr>
+        <w:pStyle w:val="Heading2"/>
+      </w:pPr>
+      <w:r>
+        <w:t>5A. Menus / Links (cara pakai)</w:t>
+      </w:r>
+    </w:p>
+    <w:p>
+      <w:pPr>
+        <w:pStyle w:val="ListNumber"/>
+      </w:pPr>
+      <w:r>
+        <w:t xml:space="preserve">WDC Site → </w:t>
+      </w:r>
+      <w:r>
+        <w:rPr>
+          <w:b/>
+        </w:rPr>
+        <w:t>Menus / Links</w:t>
+      </w:r>
+      <w:r>
+        <w:t>.</w:t>
+      </w:r>
+    </w:p>
+    <w:p>
+      <w:pPr>
+        <w:pStyle w:val="ListNumber"/>
+      </w:pPr>
+      <w:r>
+        <w:t>Edit field:</w:t>
+      </w:r>
+    </w:p>
     <w:p>
       <w:r>
+        <w:t xml:space="preserve">   - </w:t>
+      </w:r>
+      <w:r>
         <w:rPr>
-          <w:rFonts w:ascii="Calibri" w:hAnsi="Calibri" w:eastAsia="Calibri"/>
           <w:b/>
-          <w:color w:val="004A98"/>
-          <w:sz w:val="24"/>
         </w:rPr>
+        <w:t>Navbar links</w:t>
+      </w:r>
+    </w:p>
+    <w:p>
+      <w:r>
+        <w:t xml:space="preserve">   - </w:t>
+      </w:r>
+      <w:r>
+        <w:rPr>
+          <w:b/>
+        </w:rPr>
+        <w:t>Footer kolom 1 title</w:t>
+      </w:r>
+      <w:r>
+        <w:t xml:space="preserve"> (default: Jelajahi)</w:t>
+      </w:r>
+    </w:p>
+    <w:p>
+      <w:r>
+        <w:t xml:space="preserve">   - </w:t>
+      </w:r>
+      <w:r>
+        <w:rPr>
+          <w:b/>
+        </w:rPr>
+        <w:t>Footer kolom 1 links</w:t>
+      </w:r>
+    </w:p>
+    <w:p>
+      <w:r>
+        <w:t xml:space="preserve">   - </w:t>
+      </w:r>
+      <w:r>
+        <w:rPr>
+          <w:b/>
+        </w:rPr>
+        <w:t>Footer kolom 2 title</w:t>
+      </w:r>
+      <w:r>
+        <w:t xml:space="preserve"> (default: Kursus)</w:t>
+      </w:r>
+    </w:p>
+    <w:p>
+      <w:r>
+        <w:t xml:space="preserve">   - </w:t>
+      </w:r>
+      <w:r>
+        <w:rPr>
+          <w:b/>
+        </w:rPr>
+        <w:t>Footer kolom 2 links</w:t>
+      </w:r>
+    </w:p>
+    <w:p>
+      <w:pPr>
+        <w:pStyle w:val="ListNumber"/>
+      </w:pPr>
+      <w:r>
+        <w:t>Format per baris:</w:t>
+      </w:r>
+    </w:p>
+    <w:p>
+      <w:pPr>
+        <w:spacing w:before="80" w:after="160"/>
+        <w:ind w:left="216"/>
+      </w:pPr>
+      <w:r>
+        <w:rPr>
+          <w:rFonts w:ascii="Consolas" w:hAnsi="Consolas"/>
+          <w:sz w:val="18"/>
+        </w:rPr>
+        <w:t>Label|URL</w:t>
+        <w:br/>
+        <w:t>Label|URL|navkey</w:t>
+      </w:r>
+    </w:p>
+    <w:p>
+      <w:r>
+        <w:t>Contoh navbar:</w:t>
+      </w:r>
+    </w:p>
+    <w:p>
+      <w:pPr>
+        <w:spacing w:before="80" w:after="160"/>
+        <w:ind w:left="216"/>
+      </w:pPr>
+      <w:r>
+        <w:rPr>
+          <w:rFonts w:ascii="Consolas" w:hAnsi="Consolas"/>
+          <w:sz w:val="18"/>
+        </w:rPr>
+        <w:t>Beranda|/|home</w:t>
+        <w:br/>
+        <w:t>Kursus|/courses/|courses</w:t>
+        <w:br/>
+        <w:t>Peralatan|/equipment/|equipment</w:t>
+        <w:br/>
+        <w:t>Tentang|/about/|about</w:t>
+        <w:br/>
+        <w:t>Blog|/blog/|blog</w:t>
+      </w:r>
+    </w:p>
+    <w:p>
+      <w:r>
+        <w:t>Contoh footer Jelajahi:</w:t>
+      </w:r>
+    </w:p>
+    <w:p>
+      <w:pPr>
+        <w:spacing w:before="80" w:after="160"/>
+        <w:ind w:left="216"/>
+      </w:pPr>
+      <w:r>
+        <w:rPr>
+          <w:rFonts w:ascii="Consolas" w:hAnsi="Consolas"/>
+          <w:sz w:val="18"/>
+        </w:rPr>
+        <w:t>Kursus Selam|/courses/</w:t>
+        <w:br/>
+        <w:t>Peralatan Selam|/equipment/</w:t>
+        <w:br/>
+        <w:t>Testimoni|/testimonials/</w:t>
+        <w:br/>
+        <w:t>Konservasi|/conservation/</w:t>
+        <w:br/>
+        <w:t>Tentang Kami|/about/</w:t>
+        <w:br/>
+        <w:t>Blog|/blog/</w:t>
+      </w:r>
+    </w:p>
+    <w:p>
+      <w:pPr>
+        <w:pStyle w:val="ListNumber"/>
+      </w:pPr>
+      <w:r>
+        <w:t>Save Menus / Links → buka website → Ctrl+F5.</w:t>
+      </w:r>
+    </w:p>
+    <w:p>
+      <w:r>
+        <w:t>Catatan:</w:t>
+      </w:r>
+    </w:p>
+    <w:p>
+      <w:pPr>
+        <w:pStyle w:val="ListBullet"/>
+      </w:pPr>
+      <w:r>
+        <w:t>URL boleh path relatif (</w:t>
+      </w:r>
+      <w:r>
+        <w:rPr>
+          <w:rFonts w:ascii="Consolas" w:hAnsi="Consolas"/>
+          <w:sz w:val="18"/>
+        </w:rPr>
+        <w:t>/about/</w:t>
+      </w:r>
+      <w:r>
+        <w:t>) atau full URL.</w:t>
+      </w:r>
+    </w:p>
+    <w:p>
+      <w:pPr>
+        <w:pStyle w:val="ListBullet"/>
+      </w:pPr>
+      <w:r>
+        <w:t>Baris kosong diabaikan.</w:t>
+      </w:r>
+    </w:p>
+    <w:p>
+      <w:pPr>
+        <w:pStyle w:val="ListBullet"/>
+      </w:pPr>
+      <w:r>
+        <w:t xml:space="preserve">Awali baris dengan </w:t>
+      </w:r>
+      <w:r>
+        <w:rPr>
+          <w:rFonts w:ascii="Consolas" w:hAnsi="Consolas"/>
+          <w:sz w:val="18"/>
+        </w:rPr>
+        <w:t>#</w:t>
+      </w:r>
+      <w:r>
+        <w:t xml:space="preserve"> untuk komentar.</w:t>
+      </w:r>
+    </w:p>
+    <w:p>
+      <w:pPr>
+        <w:pStyle w:val="ListBullet"/>
+      </w:pPr>
+      <w:r>
+        <w:t>Tombol login/dashboard di navbar tetap otomatis (guest Masuk / logged-in Dashboard).</w:t>
+      </w:r>
+    </w:p>
+    <w:p>
+      <w:pPr>
+        <w:pStyle w:val="Heading2"/>
+      </w:pPr>
+      <w:r>
+        <w:t>5B. Partners / Trust (cara pakai)</w:t>
+      </w:r>
+    </w:p>
+    <w:p>
+      <w:pPr>
+        <w:pStyle w:val="ListNumber"/>
+      </w:pPr>
+      <w:r>
+        <w:t xml:space="preserve">WDC Site → </w:t>
+      </w:r>
+      <w:r>
+        <w:rPr>
+          <w:b/>
+        </w:rPr>
+        <w:t>Partners / Trust</w:t>
+      </w:r>
+      <w:r>
+        <w:t>.</w:t>
+      </w:r>
+    </w:p>
+    <w:p>
+      <w:pPr>
+        <w:pStyle w:val="ListNumber"/>
+      </w:pPr>
+      <w:r>
+        <w:t>Edit trust text + trust label bila perlu.</w:t>
+      </w:r>
+    </w:p>
+    <w:p>
+      <w:pPr>
+        <w:pStyle w:val="ListNumber"/>
+      </w:pPr>
+      <w:r>
+        <w:t>Di builder logo:</w:t>
+      </w:r>
+    </w:p>
+    <w:p>
+      <w:r>
+        <w:t xml:space="preserve">   - </w:t>
+      </w:r>
+      <w:r>
+        <w:rPr>
+          <w:b/>
+        </w:rPr>
+        <w:t>Pilih dari Media</w:t>
+      </w:r>
+      <w:r>
+        <w:t xml:space="preserve"> → pilih/upload logo di Media Library.</w:t>
+      </w:r>
+    </w:p>
+    <w:p>
+      <w:r>
+        <w:t xml:space="preserve">   - Isi </w:t>
+      </w:r>
+      <w:r>
+        <w:rPr>
+          <w:b/>
+        </w:rPr>
+        <w:t>Nama partner</w:t>
+      </w:r>
+      <w:r>
+        <w:t>.</w:t>
+      </w:r>
+    </w:p>
+    <w:p>
+      <w:r>
+        <w:t xml:space="preserve">   - </w:t>
+      </w:r>
+      <w:r>
+        <w:rPr>
+          <w:b/>
+        </w:rPr>
+        <w:t>Tambah logo di baris ini</w:t>
+      </w:r>
+      <w:r>
+        <w:t xml:space="preserve"> / </w:t>
+      </w:r>
+      <w:r>
+        <w:rPr>
+          <w:b/>
+        </w:rPr>
+        <w:t>Baris logo baru</w:t>
+      </w:r>
+      <w:r>
+        <w:t>.</w:t>
+      </w:r>
+    </w:p>
+    <w:p>
+      <w:pPr>
+        <w:pStyle w:val="ListNumber"/>
+      </w:pPr>
+      <w:r>
+        <w:t>Save Partners / Trust → cek homepage trust bar → Ctrl+F5.</w:t>
+      </w:r>
+    </w:p>
+    <w:p>
+      <w:r>
+        <w:t>Catatan:</w:t>
+      </w:r>
+    </w:p>
+    <w:p>
+      <w:pPr>
+        <w:pStyle w:val="ListBullet"/>
+      </w:pPr>
+      <w:r>
+        <w:t xml:space="preserve">Tidak perlu ketik filename theme </w:t>
+      </w:r>
+      <w:r>
+        <w:rPr>
+          <w:rFonts w:ascii="Consolas" w:hAnsi="Consolas"/>
+          <w:sz w:val="18"/>
+        </w:rPr>
+        <w:t>assets/partners/</w:t>
+      </w:r>
+      <w:r>
+        <w:t>.</w:t>
+      </w:r>
+    </w:p>
+    <w:p>
+      <w:pPr>
+        <w:pStyle w:val="ListBullet"/>
+      </w:pPr>
+      <w:r>
+        <w:t xml:space="preserve">Format simpan otomatis: </w:t>
+      </w:r>
+      <w:r>
+        <w:rPr>
+          <w:rFonts w:ascii="Consolas" w:hAnsi="Consolas"/>
+          <w:sz w:val="18"/>
+        </w:rPr>
+        <w:t>Nama|id:123</w:t>
+      </w:r>
+      <w:r>
+        <w:t xml:space="preserve"> (media attachment).</w:t>
+      </w:r>
+    </w:p>
+    <w:p>
+      <w:pPr>
+        <w:pStyle w:val="ListBullet"/>
+      </w:pPr>
+      <w:r>
+        <w:t xml:space="preserve">Advanced raw format tetap support: </w:t>
+      </w:r>
+      <w:r>
+        <w:rPr>
+          <w:rFonts w:ascii="Consolas" w:hAnsi="Consolas"/>
+          <w:sz w:val="18"/>
+        </w:rPr>
+        <w:t>Nama|file.webp</w:t>
+      </w:r>
+      <w:r>
+        <w:t xml:space="preserve"> / </w:t>
+      </w:r>
+      <w:r>
+        <w:rPr>
+          <w:rFonts w:ascii="Consolas" w:hAnsi="Consolas"/>
+          <w:sz w:val="18"/>
+        </w:rPr>
+        <w:t>Nama|https://...</w:t>
+      </w:r>
+      <w:r>
+        <w:t>.</w:t>
+      </w:r>
+    </w:p>
+    <w:p>
+      <w:pPr>
+        <w:pStyle w:val="ListBullet"/>
+      </w:pPr>
+      <w:r>
+        <w:t>Logo default (NAUI, TDI, DAN, Sherwood, Zeagle, Waterproof, Shearwater, BARE) sudah diimport ke Media Library live.</w:t>
+      </w:r>
+    </w:p>
+    <w:p>
+      <w:pPr>
+        <w:pStyle w:val="Heading1"/>
+      </w:pPr>
+      <w:r>
         <w:t>6. WDC Members — operasional member</w:t>
       </w:r>
     </w:p>
     <w:p>
       <w:r>
-        <w:rPr>
-          <w:rFonts w:ascii="Calibri" w:hAnsi="Calibri" w:eastAsia="Calibri"/>
-          <w:b w:val="0"/>
-          <w:color w:val="5A646E"/>
-          <w:sz w:val="18"/>
-        </w:rPr>
         <w:t>Menu kiri: WDC Members. Request, member data, giveaway, rekening.</w:t>
       </w:r>
     </w:p>
-    <w:tbl>
-      <w:tblPr>
-        <w:tblStyle w:val="TableGrid"/>
-        <w:tblW w:type="auto" w:w="0"/>
-        <w:tblLook w:firstColumn="1" w:firstRow="1" w:lastColumn="0" w:lastRow="0" w:noHBand="0" w:noVBand="1" w:val="04A0"/>
-      </w:tblPr>
-      <w:tblGrid>
-        <w:gridCol w:w="3456"/>
-        <w:gridCol w:w="3456"/>
-        <w:gridCol w:w="3456"/>
-      </w:tblGrid>
-      <w:tr>
-        <w:tc>
-          <w:tcPr>
-            <w:tcW w:type="dxa" w:w="3456"/>
-          </w:tcPr>
-          <w:p>
-            <w:r>
-              <w:t>Menu</w:t>
-            </w:r>
-          </w:p>
-        </w:tc>
-        <w:tc>
-          <w:tcPr>
-            <w:tcW w:type="dxa" w:w="3456"/>
-          </w:tcPr>
-          <w:p>
-            <w:r>
-              <w:t>Fungsi</w:t>
-            </w:r>
-          </w:p>
-        </w:tc>
-        <w:tc>
-          <w:tcPr>
-            <w:tcW w:type="dxa" w:w="3456"/>
-          </w:tcPr>
-          <w:p>
-            <w:r>
-              <w:t>Cara pakai</w:t>
-            </w:r>
-          </w:p>
-        </w:tc>
-      </w:tr>
-      <w:tr>
-        <w:tc>
-          <w:tcPr>
-            <w:tcW w:type="dxa" w:w="3456"/>
-          </w:tcPr>
-          <w:p>
-            <w:r>
-              <w:t>Dashboard</w:t>
-            </w:r>
-          </w:p>
-        </w:tc>
-        <w:tc>
-          <w:tcPr>
-            <w:tcW w:type="dxa" w:w="3456"/>
-          </w:tcPr>
-          <w:p>
-            <w:r>
-              <w:t>Ringkasan ops member/request.</w:t>
-            </w:r>
-          </w:p>
-        </w:tc>
-        <w:tc>
-          <w:tcPr>
-            <w:tcW w:type="dxa" w:w="3456"/>
-          </w:tcPr>
-          <w:p>
-            <w:r>
-              <w:t>Buka WDC Members untuk overview.</w:t>
-            </w:r>
-          </w:p>
-        </w:tc>
-      </w:tr>
-      <w:tr>
-        <w:tc>
-          <w:tcPr>
-            <w:tcW w:type="dxa" w:w="3456"/>
-          </w:tcPr>
-          <w:p>
-            <w:r>
-              <w:t>Member List</w:t>
-            </w:r>
-          </w:p>
-        </w:tc>
-        <w:tc>
-          <w:tcPr>
-            <w:tcW w:type="dxa" w:w="3456"/>
-          </w:tcPr>
-          <w:p>
-            <w:r>
-              <w:t>Daftar member + data akun + completed courses.</w:t>
-            </w:r>
-          </w:p>
-        </w:tc>
-        <w:tc>
-          <w:tcPr>
-            <w:tcW w:type="dxa" w:w="3456"/>
-          </w:tcPr>
-          <w:p>
-            <w:r>
-              <w:t>Cari member → buka detail → edit bila perlu → Save.</w:t>
-            </w:r>
-          </w:p>
-        </w:tc>
-      </w:tr>
-      <w:tr>
-        <w:tc>
-          <w:tcPr>
-            <w:tcW w:type="dxa" w:w="3456"/>
-          </w:tcPr>
-          <w:p>
-            <w:r>
-              <w:t>Course Requests</w:t>
-            </w:r>
-          </w:p>
-        </w:tc>
-        <w:tc>
-          <w:tcPr>
-            <w:tcW w:type="dxa" w:w="3456"/>
-          </w:tcPr>
-          <w:p>
-            <w:r>
-              <w:t>Permintaan/review kursus dari member.</w:t>
-            </w:r>
-          </w:p>
-        </w:tc>
-        <w:tc>
-          <w:tcPr>
-            <w:tcW w:type="dxa" w:w="3456"/>
-          </w:tcPr>
-          <w:p>
-            <w:r>
-              <w:t>Buka list → update status + admin note → Save / Verify / Cancel.</w:t>
-            </w:r>
-          </w:p>
-        </w:tc>
-      </w:tr>
-      <w:tr>
-        <w:tc>
-          <w:tcPr>
-            <w:tcW w:type="dxa" w:w="3456"/>
-          </w:tcPr>
-          <w:p>
-            <w:r>
-              <w:t>Gear Requests</w:t>
-            </w:r>
-          </w:p>
-        </w:tc>
-        <w:tc>
-          <w:tcPr>
-            <w:tcW w:type="dxa" w:w="3456"/>
-          </w:tcPr>
-          <w:p>
-            <w:r>
-              <w:t>Permintaan fitting/ketersediaan gear.</w:t>
-            </w:r>
-          </w:p>
-        </w:tc>
-        <w:tc>
-          <w:tcPr>
-            <w:tcW w:type="dxa" w:w="3456"/>
-          </w:tcPr>
-          <w:p>
-            <w:r>
-              <w:t>Update status + note → Save.</w:t>
-            </w:r>
-          </w:p>
-        </w:tc>
-      </w:tr>
-      <w:tr>
-        <w:tc>
-          <w:tcPr>
-            <w:tcW w:type="dxa" w:w="3456"/>
-          </w:tcPr>
-          <w:p>
-            <w:r>
-              <w:t>Giveaway Orders</w:t>
-            </w:r>
-          </w:p>
-        </w:tc>
-        <w:tc>
-          <w:tcPr>
-            <w:tcW w:type="dxa" w:w="3456"/>
-          </w:tcPr>
-          <w:p>
-            <w:r>
-              <w:t>Order giveaway: SS ongkir, bukti TF, resi.</w:t>
-            </w:r>
-          </w:p>
-        </w:tc>
-        <w:tc>
-          <w:tcPr>
-            <w:tcW w:type="dxa" w:w="3456"/>
-          </w:tcPr>
-          <w:p>
-            <w:r>
-              <w:t>Filter status → buka baris → cek SS/TF → Verifikasi → isi kurir + no.resi → set Shipped → Save. Pakai tombol Cek Ongkir / Cek Resi di atas halaman.</w:t>
-            </w:r>
-          </w:p>
-        </w:tc>
-      </w:tr>
-      <w:tr>
-        <w:tc>
-          <w:tcPr>
-            <w:tcW w:type="dxa" w:w="3456"/>
-          </w:tcPr>
-          <w:p>
-            <w:r>
-              <w:t>Payment Settings</w:t>
-            </w:r>
-          </w:p>
-        </w:tc>
-        <w:tc>
-          <w:tcPr>
-            <w:tcW w:type="dxa" w:w="3456"/>
-          </w:tcPr>
-          <w:p>
-            <w:r>
-              <w:t>Rekening bank TF (sumber nomor rekening).</w:t>
-            </w:r>
-          </w:p>
-        </w:tc>
-        <w:tc>
-          <w:tcPr>
-            <w:tcW w:type="dxa" w:w="3456"/>
-          </w:tcPr>
-          <w:p>
-            <w:r>
-              <w:t>Isi bank, no.rek, atas nama → Save. Jangan ubah Midtrans sembarangan.</w:t>
-            </w:r>
-          </w:p>
-        </w:tc>
-      </w:tr>
-    </w:tbl>
-    <w:p/>
     <w:p>
+      <w:pPr>
+        <w:pStyle w:val="ListBullet"/>
+      </w:pPr>
       <w:r>
         <w:rPr>
-          <w:rFonts w:ascii="Calibri" w:hAnsi="Calibri" w:eastAsia="Calibri"/>
           <w:b/>
-          <w:color w:val="004A98"/>
-          <w:sz w:val="24"/>
         </w:rPr>
+        <w:t>Dashboard</w:t>
+      </w:r>
+      <w:r>
+        <w:t xml:space="preserve"> — ringkasan ops.</w:t>
+      </w:r>
+    </w:p>
+    <w:p>
+      <w:pPr>
+        <w:pStyle w:val="ListBullet"/>
+      </w:pPr>
+      <w:r>
+        <w:rPr>
+          <w:b/>
+        </w:rPr>
+        <w:t>Member List</w:t>
+      </w:r>
+      <w:r>
+        <w:t xml:space="preserve"> — data member + completed courses.</w:t>
+      </w:r>
+    </w:p>
+    <w:p>
+      <w:pPr>
+        <w:pStyle w:val="ListBullet"/>
+      </w:pPr>
+      <w:r>
+        <w:rPr>
+          <w:b/>
+        </w:rPr>
+        <w:t>Course Requests</w:t>
+      </w:r>
+      <w:r>
+        <w:t xml:space="preserve"> — permintaan kursus: update status + note.</w:t>
+      </w:r>
+    </w:p>
+    <w:p>
+      <w:pPr>
+        <w:pStyle w:val="ListBullet"/>
+      </w:pPr>
+      <w:r>
+        <w:rPr>
+          <w:b/>
+        </w:rPr>
+        <w:t>Gear Requests</w:t>
+      </w:r>
+      <w:r>
+        <w:t xml:space="preserve"> — fitting/ketersediaan gear.</w:t>
+      </w:r>
+    </w:p>
+    <w:p>
+      <w:pPr>
+        <w:pStyle w:val="ListBullet"/>
+      </w:pPr>
+      <w:r>
+        <w:rPr>
+          <w:b/>
+        </w:rPr>
+        <w:t>Giveaway Orders</w:t>
+      </w:r>
+      <w:r>
+        <w:t xml:space="preserve"> — SS ongkir, bukti TF, resi; tombol Cek Ongkir / Cek Resi.</w:t>
+      </w:r>
+    </w:p>
+    <w:p>
+      <w:pPr>
+        <w:pStyle w:val="ListBullet"/>
+      </w:pPr>
+      <w:r>
+        <w:rPr>
+          <w:b/>
+        </w:rPr>
+        <w:t>Payment Settings</w:t>
+      </w:r>
+      <w:r>
+        <w:t xml:space="preserve"> — rekening bank TF (sumber nomor rekening). Jangan ubah Midtrans sembarangan.</w:t>
+      </w:r>
+    </w:p>
+    <w:p>
+      <w:pPr>
+        <w:pStyle w:val="Heading1"/>
+      </w:pPr>
+      <w:r>
         <w:t>7. Giveaway Settings (jika muncul di admin)</w:t>
       </w:r>
     </w:p>
     <w:p>
+      <w:pPr>
+        <w:pStyle w:val="ListBullet"/>
+      </w:pPr>
       <w:r>
         <w:rPr>
-          <w:rFonts w:ascii="Calibri" w:hAnsi="Calibri" w:eastAsia="Calibri"/>
-          <w:b w:val="0"/>
-          <w:color w:val="5A646E"/>
-          <w:sz w:val="18"/>
+          <w:b/>
         </w:rPr>
-        <w:t>Submenu giveaway settings (URL eksternal ongkir/resi, origin label, enable giveaway).</w:t>
+        <w:t>Giveaway Settings</w:t>
       </w:r>
-    </w:p>
-    <w:tbl>
-      <w:tblPr>
-        <w:tblStyle w:val="TableGrid"/>
-        <w:tblW w:type="auto" w:w="0"/>
-        <w:tblLook w:firstColumn="1" w:firstRow="1" w:lastColumn="0" w:lastRow="0" w:noHBand="0" w:noVBand="1" w:val="04A0"/>
-      </w:tblPr>
-      <w:tblGrid>
-        <w:gridCol w:w="3456"/>
-        <w:gridCol w:w="3456"/>
-        <w:gridCol w:w="3456"/>
-      </w:tblGrid>
-      <w:tr>
-        <w:tc>
-          <w:tcPr>
-            <w:tcW w:type="dxa" w:w="3456"/>
-          </w:tcPr>
-          <w:p>
-            <w:r>
-              <w:t>Menu</w:t>
-            </w:r>
-          </w:p>
-        </w:tc>
-        <w:tc>
-          <w:tcPr>
-            <w:tcW w:type="dxa" w:w="3456"/>
-          </w:tcPr>
-          <w:p>
-            <w:r>
-              <w:t>Fungsi</w:t>
-            </w:r>
-          </w:p>
-        </w:tc>
-        <w:tc>
-          <w:tcPr>
-            <w:tcW w:type="dxa" w:w="3456"/>
-          </w:tcPr>
-          <w:p>
-            <w:r>
-              <w:t>Cara pakai</w:t>
-            </w:r>
-          </w:p>
-        </w:tc>
-      </w:tr>
-      <w:tr>
-        <w:tc>
-          <w:tcPr>
-            <w:tcW w:type="dxa" w:w="3456"/>
-          </w:tcPr>
-          <w:p>
-            <w:r>
-              <w:t>Giveaway Settings</w:t>
-            </w:r>
-          </w:p>
-        </w:tc>
-        <w:tc>
-          <w:tcPr>
-            <w:tcW w:type="dxa" w:w="3456"/>
-          </w:tcPr>
-          <w:p>
-            <w:r>
-              <w:t>Aktifkan giveaway + link cek ongkir/resi + label asal kirim.</w:t>
-            </w:r>
-          </w:p>
-        </w:tc>
-        <w:tc>
-          <w:tcPr>
-            <w:tcW w:type="dxa" w:w="3456"/>
-          </w:tcPr>
-          <w:p>
-            <w:r>
-              <w:t>Set Cek Ongkir = https://berdu.id/cek-ongkir · Cek Resi = https://cekresi.com/ · isi origin label → Save.</w:t>
-            </w:r>
-          </w:p>
-        </w:tc>
-      </w:tr>
-      <w:tr>
-        <w:tc>
-          <w:tcPr>
-            <w:tcW w:type="dxa" w:w="3456"/>
-          </w:tcPr>
-          <w:p>
-            <w:r>
-              <w:t>Giveaway Orders</w:t>
-            </w:r>
-          </w:p>
-        </w:tc>
-        <w:tc>
-          <w:tcPr>
-            <w:tcW w:type="dxa" w:w="3456"/>
-          </w:tcPr>
-          <w:p>
-            <w:r>
-              <w:t>Sama seperti di WDC Members (bisa muncul di 2 tempat).</w:t>
-            </w:r>
-          </w:p>
-        </w:tc>
-        <w:tc>
-          <w:tcPr>
-            <w:tcW w:type="dxa" w:w="3456"/>
-          </w:tcPr>
-          <w:p>
-            <w:r>
-              <w:t>Proses order giveaway di sini atau lewat WDC Members → Giveaway Orders.</w:t>
-            </w:r>
-          </w:p>
-        </w:tc>
-      </w:tr>
-    </w:tbl>
-    <w:p/>
-    <w:p>
       <w:r>
-        <w:rPr>
-          <w:rFonts w:ascii="Calibri" w:hAnsi="Calibri" w:eastAsia="Calibri"/>
-          <w:b/>
-          <w:color w:val="004A98"/>
-          <w:sz w:val="24"/>
-        </w:rPr>
-        <w:t>8. Posts (blog) — WP standar yang dipakai</w:t>
+        <w:t xml:space="preserve"> — enable giveaway + link cek ongkir/resi + origin label.</w:t>
       </w:r>
     </w:p>
     <w:p>
       <w:r>
+        <w:t xml:space="preserve">  - Cek Ongkir = https://berdu.id/cek-ongkir</w:t>
+      </w:r>
+    </w:p>
+    <w:p>
+      <w:r>
+        <w:t xml:space="preserve">  - Cek Resi = https://cekresi.com/</w:t>
+      </w:r>
+    </w:p>
+    <w:p>
+      <w:pPr>
+        <w:pStyle w:val="ListBullet"/>
+      </w:pPr>
+      <w:r>
         <w:rPr>
-          <w:rFonts w:ascii="Calibri" w:hAnsi="Calibri" w:eastAsia="Calibri"/>
-          <w:b w:val="0"/>
-          <w:color w:val="5A646E"/>
+          <w:b/>
+        </w:rPr>
+        <w:t>Giveaway Orders</w:t>
+      </w:r>
+      <w:r>
+        <w:t xml:space="preserve"> — proses order (bisa muncul di 2 tempat).</w:t>
+      </w:r>
+    </w:p>
+    <w:p>
+      <w:pPr>
+        <w:pStyle w:val="Heading1"/>
+      </w:pPr>
+      <w:r>
+        <w:t>8. Posts (blog) + Media</w:t>
+      </w:r>
+    </w:p>
+    <w:p>
+      <w:pPr>
+        <w:pStyle w:val="ListBullet"/>
+      </w:pPr>
+      <w:r>
+        <w:rPr>
+          <w:b/>
+        </w:rPr>
+        <w:t>Posts</w:t>
+      </w:r>
+      <w:r>
+        <w:t xml:space="preserve"> — artikel blog public di </w:t>
+      </w:r>
+      <w:r>
+        <w:rPr>
+          <w:rFonts w:ascii="Consolas" w:hAnsi="Consolas"/>
           <w:sz w:val="18"/>
         </w:rPr>
-        <w:t>Bukan CPT custom, tapi dipakai konten public.</w:t>
+        <w:t>/blog/</w:t>
+      </w:r>
+      <w:r>
+        <w:t>.</w:t>
       </w:r>
     </w:p>
-    <w:tbl>
-      <w:tblPr>
-        <w:tblStyle w:val="TableGrid"/>
-        <w:tblW w:type="auto" w:w="0"/>
-        <w:tblLook w:firstColumn="1" w:firstRow="1" w:lastColumn="0" w:lastRow="0" w:noHBand="0" w:noVBand="1" w:val="04A0"/>
-      </w:tblPr>
-      <w:tblGrid>
-        <w:gridCol w:w="3456"/>
-        <w:gridCol w:w="3456"/>
-        <w:gridCol w:w="3456"/>
-      </w:tblGrid>
-      <w:tr>
-        <w:tc>
-          <w:tcPr>
-            <w:tcW w:type="dxa" w:w="3456"/>
-          </w:tcPr>
-          <w:p>
-            <w:r>
-              <w:t>Menu</w:t>
-            </w:r>
-          </w:p>
-        </w:tc>
-        <w:tc>
-          <w:tcPr>
-            <w:tcW w:type="dxa" w:w="3456"/>
-          </w:tcPr>
-          <w:p>
-            <w:r>
-              <w:t>Fungsi</w:t>
-            </w:r>
-          </w:p>
-        </w:tc>
-        <w:tc>
-          <w:tcPr>
-            <w:tcW w:type="dxa" w:w="3456"/>
-          </w:tcPr>
-          <w:p>
-            <w:r>
-              <w:t>Cara pakai</w:t>
-            </w:r>
-          </w:p>
-        </w:tc>
-      </w:tr>
-      <w:tr>
-        <w:tc>
-          <w:tcPr>
-            <w:tcW w:type="dxa" w:w="3456"/>
-          </w:tcPr>
-          <w:p>
-            <w:r>
-              <w:t>Posts</w:t>
-            </w:r>
-          </w:p>
-        </w:tc>
-        <w:tc>
-          <w:tcPr>
-            <w:tcW w:type="dxa" w:w="3456"/>
-          </w:tcPr>
-          <w:p>
-            <w:r>
-              <w:t>Artikel blog public.</w:t>
-            </w:r>
-          </w:p>
-        </w:tc>
-        <w:tc>
-          <w:tcPr>
-            <w:tcW w:type="dxa" w:w="3456"/>
-          </w:tcPr>
-          <w:p>
-            <w:r>
-              <w:t>Posts → Add New / Edit → Publish. Tampil di /blog/.</w:t>
-            </w:r>
-          </w:p>
-        </w:tc>
-      </w:tr>
-      <w:tr>
-        <w:tc>
-          <w:tcPr>
-            <w:tcW w:type="dxa" w:w="3456"/>
-          </w:tcPr>
-          <w:p>
-            <w:r>
-              <w:t>Media</w:t>
-            </w:r>
-          </w:p>
-        </w:tc>
-        <w:tc>
-          <w:tcPr>
-            <w:tcW w:type="dxa" w:w="3456"/>
-          </w:tcPr>
-          <w:p>
-            <w:r>
-              <w:t>Upload foto/file.</w:t>
-            </w:r>
-          </w:p>
-        </w:tc>
-        <w:tc>
-          <w:tcPr>
-            <w:tcW w:type="dxa" w:w="3456"/>
-          </w:tcPr>
-          <w:p>
-            <w:r>
-              <w:t>Media → Add New → pakai di course/equipment/crew/post.</w:t>
-            </w:r>
-          </w:p>
-        </w:tc>
-      </w:tr>
-    </w:tbl>
-    <w:p/>
     <w:p>
+      <w:pPr>
+        <w:pStyle w:val="ListBullet"/>
+      </w:pPr>
       <w:r>
         <w:rPr>
-          <w:rFonts w:ascii="Calibri" w:hAnsi="Calibri" w:eastAsia="Calibri"/>
           <w:b/>
-          <w:color w:val="004A98"/>
-          <w:sz w:val="24"/>
         </w:rPr>
+        <w:t>Media</w:t>
+      </w:r>
+      <w:r>
+        <w:t xml:space="preserve"> — upload foto/file; dipakai course/equipment/crew/post/partner logos.</w:t>
+      </w:r>
+    </w:p>
+    <w:p>
+      <w:pPr>
+        <w:pStyle w:val="Heading1"/>
+      </w:pPr>
+      <w:r>
+        <w:t>9. Auth public (bukan menu admin)</w:t>
+      </w:r>
+    </w:p>
+    <w:p>
+      <w:pPr>
+        <w:pStyle w:val="ListBullet"/>
+      </w:pPr>
+      <w:r>
+        <w:t>Login member: https://whaledivecentre.com/login/</w:t>
+      </w:r>
+    </w:p>
+    <w:p>
+      <w:pPr>
+        <w:pStyle w:val="ListBullet"/>
+      </w:pPr>
+      <w:r>
+        <w:t>Register member: https://whaledivecentre.com/register/</w:t>
+      </w:r>
+    </w:p>
+    <w:p>
+      <w:pPr>
+        <w:pStyle w:val="ListBullet"/>
+      </w:pPr>
+      <w:r>
+        <w:t xml:space="preserve">Legacy </w:t>
+      </w:r>
+      <w:r>
+        <w:rPr>
+          <w:rFonts w:ascii="Consolas" w:hAnsi="Consolas"/>
+          <w:sz w:val="18"/>
+        </w:rPr>
+        <w:t>/member-register/</w:t>
+      </w:r>
+      <w:r>
+        <w:t xml:space="preserve"> redirect ke </w:t>
+      </w:r>
+      <w:r>
+        <w:rPr>
+          <w:rFonts w:ascii="Consolas" w:hAnsi="Consolas"/>
+          <w:sz w:val="18"/>
+        </w:rPr>
+        <w:t>/register/</w:t>
+      </w:r>
+    </w:p>
+    <w:p>
+      <w:pPr>
+        <w:pStyle w:val="ListBullet"/>
+      </w:pPr>
+      <w:r>
+        <w:t>Auth page clean (tanpa public header/footer, tanpa kicker badge).</w:t>
+      </w:r>
+    </w:p>
+    <w:p>
+      <w:pPr>
+        <w:pStyle w:val="ListBullet"/>
+      </w:pPr>
+      <w:r>
+        <w:t xml:space="preserve">Setelah login, header public tombol = </w:t>
+      </w:r>
+      <w:r>
+        <w:rPr>
+          <w:b/>
+        </w:rPr>
+        <w:t>Dashboard</w:t>
+      </w:r>
+      <w:r>
+        <w:t>.</w:t>
+      </w:r>
+    </w:p>
+    <w:p>
+      <w:pPr>
+        <w:pStyle w:val="Heading1"/>
+      </w:pPr>
+      <w:r>
         <w:t>Tidak untuk harian / disembunyikan</w:t>
       </w:r>
     </w:p>
-    <w:tbl>
-      <w:tblPr>
-        <w:tblStyle w:val="TableGrid"/>
-        <w:tblW w:type="auto" w:w="0"/>
-        <w:tblLook w:firstColumn="1" w:firstRow="1" w:lastColumn="0" w:lastRow="0" w:noHBand="0" w:noVBand="1" w:val="04A0"/>
-      </w:tblPr>
-      <w:tblGrid>
-        <w:gridCol w:w="3456"/>
-        <w:gridCol w:w="3456"/>
-        <w:gridCol w:w="3456"/>
-      </w:tblGrid>
-      <w:tr>
-        <w:tc>
-          <w:tcPr>
-            <w:tcW w:type="dxa" w:w="3456"/>
-          </w:tcPr>
-          <w:p>
-            <w:r>
-              <w:t>Item</w:t>
-            </w:r>
-          </w:p>
-        </w:tc>
-        <w:tc>
-          <w:tcPr>
-            <w:tcW w:type="dxa" w:w="3456"/>
-          </w:tcPr>
-          <w:p>
-            <w:r>
-              <w:t>Fungsi</w:t>
-            </w:r>
-          </w:p>
-        </w:tc>
-        <w:tc>
-          <w:tcPr>
-            <w:tcW w:type="dxa" w:w="3456"/>
-          </w:tcPr>
-          <w:p>
-            <w:r>
-              <w:t>Catatan</w:t>
-            </w:r>
-          </w:p>
-        </w:tc>
-      </w:tr>
-      <w:tr>
-        <w:tc>
-          <w:tcPr>
-            <w:tcW w:type="dxa" w:w="3456"/>
-          </w:tcPr>
-          <w:p>
-            <w:r>
-              <w:t>Dive Sites</w:t>
-            </w:r>
-          </w:p>
-        </w:tc>
-        <w:tc>
-          <w:tcPr>
-            <w:tcW w:type="dxa" w:w="3456"/>
-          </w:tcPr>
-          <w:p>
-            <w:r>
-              <w:t>CPT lama, menu disembunyikan (data draft disimpan).</w:t>
-            </w:r>
-          </w:p>
-        </w:tc>
-        <w:tc>
-          <w:tcPr>
-            <w:tcW w:type="dxa" w:w="3456"/>
-          </w:tcPr>
-          <w:p>
-            <w:r>
-              <w:t>Tidak dipakai di public site. Jangan andalkan untuk konten harian.</w:t>
-            </w:r>
-          </w:p>
-        </w:tc>
-      </w:tr>
-      <w:tr>
-        <w:tc>
-          <w:tcPr>
-            <w:tcW w:type="dxa" w:w="3456"/>
-          </w:tcPr>
-          <w:p>
-            <w:r>
-              <w:t>Catalog Images (hidden tool)</w:t>
-            </w:r>
-          </w:p>
-        </w:tc>
-        <w:tc>
-          <w:tcPr>
-            <w:tcW w:type="dxa" w:w="3456"/>
-          </w:tcPr>
-          <w:p>
-            <w:r>
-              <w:t>Tool backfill foto catalog dari assets tema.</w:t>
-            </w:r>
-          </w:p>
-        </w:tc>
-        <w:tc>
-          <w:tcPr>
-            <w:tcW w:type="dxa" w:w="3456"/>
-          </w:tcPr>
-          <w:p>
-            <w:r>
-              <w:t>Bukan menu sidebar harian. Foto harian: edit Featured Image di Courses/Equipment.</w:t>
-            </w:r>
-          </w:p>
-        </w:tc>
-      </w:tr>
-      <w:tr>
-        <w:tc>
-          <w:tcPr>
-            <w:tcW w:type="dxa" w:w="3456"/>
-          </w:tcPr>
-          <w:p>
-            <w:r>
-              <w:t>Direct Orders / Input Pesanan</w:t>
-            </w:r>
-          </w:p>
-        </w:tc>
-        <w:tc>
-          <w:tcPr>
-            <w:tcW w:type="dxa" w:w="3456"/>
-          </w:tcPr>
-          <w:p>
-            <w:r>
-              <w:t>Menu order lama dihapus/disembunyikan.</w:t>
-            </w:r>
-          </w:p>
-        </w:tc>
-        <w:tc>
-          <w:tcPr>
-            <w:tcW w:type="dxa" w:w="3456"/>
-          </w:tcPr>
-          <w:p>
-            <w:r>
-              <w:t>Flow sekarang WA-first + Course/Gear Requests + Giveaway Orders.</w:t>
-            </w:r>
-          </w:p>
-        </w:tc>
-      </w:tr>
-    </w:tbl>
-    <w:p/>
     <w:p>
+      <w:pPr>
+        <w:pStyle w:val="ListBullet"/>
+      </w:pPr>
       <w:r>
         <w:rPr>
-          <w:rFonts w:ascii="Calibri" w:hAnsi="Calibri" w:eastAsia="Calibri"/>
           <w:b/>
-          <w:color w:val="004A98"/>
-          <w:sz w:val="24"/>
         </w:rPr>
+        <w:t>Dive Sites</w:t>
+      </w:r>
+      <w:r>
+        <w:t xml:space="preserve"> — CPT lama, menu disembunyikan.</w:t>
+      </w:r>
+    </w:p>
+    <w:p>
+      <w:pPr>
+        <w:pStyle w:val="ListBullet"/>
+      </w:pPr>
+      <w:r>
+        <w:rPr>
+          <w:b/>
+        </w:rPr>
+        <w:t>Catalog Images (hidden tool)</w:t>
+      </w:r>
+      <w:r>
+        <w:t xml:space="preserve"> — backfill foto; harian pakai Featured Image.</w:t>
+      </w:r>
+    </w:p>
+    <w:p>
+      <w:pPr>
+        <w:pStyle w:val="ListBullet"/>
+      </w:pPr>
+      <w:r>
+        <w:rPr>
+          <w:b/>
+        </w:rPr>
+        <w:t>Direct Orders / Input Pesanan</w:t>
+      </w:r>
+      <w:r>
+        <w:t xml:space="preserve"> — dihapus/disembunyikan. Flow: WA-first + Requests + Giveaway.</w:t>
+      </w:r>
+    </w:p>
+    <w:p>
+      <w:pPr>
+        <w:pStyle w:val="Heading1"/>
+      </w:pPr>
+      <w:r>
         <w:t>Link penting</w:t>
       </w:r>
     </w:p>
-    <w:tbl>
-      <w:tblPr>
-        <w:tblStyle w:val="TableGrid"/>
-        <w:tblW w:type="auto" w:w="0"/>
-        <w:tblLook w:firstColumn="1" w:firstRow="1" w:lastColumn="0" w:lastRow="0" w:noHBand="0" w:noVBand="1" w:val="04A0"/>
-      </w:tblPr>
-      <w:tblGrid>
-        <w:gridCol w:w="3456"/>
-        <w:gridCol w:w="3456"/>
-        <w:gridCol w:w="3456"/>
-      </w:tblGrid>
-      <w:tr>
-        <w:tc>
-          <w:tcPr>
-            <w:tcW w:type="dxa" w:w="3456"/>
-          </w:tcPr>
-          <w:p>
-            <w:r>
-              <w:t>Nama</w:t>
-            </w:r>
-          </w:p>
-        </w:tc>
-        <w:tc>
-          <w:tcPr>
-            <w:tcW w:type="dxa" w:w="3456"/>
-          </w:tcPr>
-          <w:p>
-            <w:r>
-              <w:t>URL</w:t>
-            </w:r>
-          </w:p>
-        </w:tc>
-        <w:tc>
-          <w:tcPr>
-            <w:tcW w:type="dxa" w:w="3456"/>
-          </w:tcPr>
-          <w:p>
-            <w:r>
-              <w:t>Keterangan</w:t>
-            </w:r>
-          </w:p>
-        </w:tc>
-      </w:tr>
-      <w:tr>
-        <w:tc>
-          <w:tcPr>
-            <w:tcW w:type="dxa" w:w="3456"/>
-          </w:tcPr>
-          <w:p>
-            <w:r>
-              <w:t>Website live</w:t>
-            </w:r>
-          </w:p>
-        </w:tc>
-        <w:tc>
-          <w:tcPr>
-            <w:tcW w:type="dxa" w:w="3456"/>
-          </w:tcPr>
-          <w:p>
-            <w:r>
-              <w:t>https://whaledivecentre.com</w:t>
-            </w:r>
-          </w:p>
-        </w:tc>
-        <w:tc>
-          <w:tcPr>
-            <w:tcW w:type="dxa" w:w="3456"/>
-          </w:tcPr>
-          <w:p>
-            <w:r>
-              <w:t>Cek hasil edit. Selalu Ctrl+F5.</w:t>
-            </w:r>
-          </w:p>
-        </w:tc>
-      </w:tr>
-      <w:tr>
-        <w:tc>
-          <w:tcPr>
-            <w:tcW w:type="dxa" w:w="3456"/>
-          </w:tcPr>
-          <w:p>
-            <w:r>
-              <w:t>Login member public</w:t>
-            </w:r>
-          </w:p>
-        </w:tc>
-        <w:tc>
-          <w:tcPr>
-            <w:tcW w:type="dxa" w:w="3456"/>
-          </w:tcPr>
-          <w:p>
-            <w:r>
-              <w:t>https://whaledivecentre.com/login/</w:t>
-            </w:r>
-          </w:p>
-        </w:tc>
-        <w:tc>
-          <w:tcPr>
-            <w:tcW w:type="dxa" w:w="3456"/>
-          </w:tcPr>
-          <w:p>
-            <w:r>
-              <w:t>Bukan /wp-admin.</w:t>
-            </w:r>
-          </w:p>
-        </w:tc>
-      </w:tr>
-      <w:tr>
-        <w:tc>
-          <w:tcPr>
-            <w:tcW w:type="dxa" w:w="3456"/>
-          </w:tcPr>
-          <w:p>
-            <w:r>
-              <w:t>Courses public</w:t>
-            </w:r>
-          </w:p>
-        </w:tc>
-        <w:tc>
-          <w:tcPr>
-            <w:tcW w:type="dxa" w:w="3456"/>
-          </w:tcPr>
-          <w:p>
-            <w:r>
-              <w:t>https://whaledivecentre.com/courses/</w:t>
-            </w:r>
-          </w:p>
-        </w:tc>
-        <w:tc>
-          <w:tcPr>
-            <w:tcW w:type="dxa" w:w="3456"/>
-          </w:tcPr>
-          <w:p>
-            <w:r>
-              <w:t>Hasil menu Courses.</w:t>
-            </w:r>
-          </w:p>
-        </w:tc>
-      </w:tr>
-      <w:tr>
-        <w:tc>
-          <w:tcPr>
-            <w:tcW w:type="dxa" w:w="3456"/>
-          </w:tcPr>
-          <w:p>
-            <w:r>
-              <w:t>Equipment public</w:t>
-            </w:r>
-          </w:p>
-        </w:tc>
-        <w:tc>
-          <w:tcPr>
-            <w:tcW w:type="dxa" w:w="3456"/>
-          </w:tcPr>
-          <w:p>
-            <w:r>
-              <w:t>https://whaledivecentre.com/equipment/</w:t>
-            </w:r>
-          </w:p>
-        </w:tc>
-        <w:tc>
-          <w:tcPr>
-            <w:tcW w:type="dxa" w:w="3456"/>
-          </w:tcPr>
-          <w:p>
-            <w:r>
-              <w:t>Hasil menu Equipment.</w:t>
-            </w:r>
-          </w:p>
-        </w:tc>
-      </w:tr>
-      <w:tr>
-        <w:tc>
-          <w:tcPr>
-            <w:tcW w:type="dxa" w:w="3456"/>
-          </w:tcPr>
-          <w:p>
-            <w:r>
-              <w:t>Cek Ongkir giveaway</w:t>
-            </w:r>
-          </w:p>
-        </w:tc>
-        <w:tc>
-          <w:tcPr>
-            <w:tcW w:type="dxa" w:w="3456"/>
-          </w:tcPr>
-          <w:p>
-            <w:r>
-              <w:t>https://berdu.id/cek-ongkir</w:t>
-            </w:r>
-          </w:p>
-        </w:tc>
-        <w:tc>
-          <w:tcPr>
-            <w:tcW w:type="dxa" w:w="3456"/>
-          </w:tcPr>
-          <w:p>
-            <w:r>
-              <w:t>Hitung ongkir eksternal.</w:t>
-            </w:r>
-          </w:p>
-        </w:tc>
-      </w:tr>
-      <w:tr>
-        <w:tc>
-          <w:tcPr>
-            <w:tcW w:type="dxa" w:w="3456"/>
-          </w:tcPr>
-          <w:p>
-            <w:r>
-              <w:t>Cek Resi giveaway</w:t>
-            </w:r>
-          </w:p>
-        </w:tc>
-        <w:tc>
-          <w:tcPr>
-            <w:tcW w:type="dxa" w:w="3456"/>
-          </w:tcPr>
-          <w:p>
-            <w:r>
-              <w:t>https://cekresi.com/</w:t>
-            </w:r>
-          </w:p>
-        </w:tc>
-        <w:tc>
-          <w:tcPr>
-            <w:tcW w:type="dxa" w:w="3456"/>
-          </w:tcPr>
-          <w:p>
-            <w:r>
-              <w:t>Tracking resi setelah admin isi resi.</w:t>
-            </w:r>
-          </w:p>
-        </w:tc>
-      </w:tr>
-    </w:tbl>
-    <w:p/>
     <w:p>
+      <w:pPr>
+        <w:pStyle w:val="ListBullet"/>
+      </w:pPr>
       <w:r>
         <w:rPr>
-          <w:rFonts w:ascii="Calibri" w:hAnsi="Calibri" w:eastAsia="Calibri"/>
           <w:b/>
-          <w:color w:val="004A98"/>
-          <w:sz w:val="24"/>
         </w:rPr>
+        <w:t>Website live:</w:t>
+      </w:r>
+      <w:r>
+        <w:t xml:space="preserve"> https://whaledivecentre.com — cek hasil edit, selalu Ctrl+F5.</w:t>
+      </w:r>
+    </w:p>
+    <w:p>
+      <w:pPr>
+        <w:pStyle w:val="ListBullet"/>
+      </w:pPr>
+      <w:r>
+        <w:rPr>
+          <w:b/>
+        </w:rPr>
+        <w:t>Login member public:</w:t>
+      </w:r>
+      <w:r>
+        <w:t xml:space="preserve"> https://whaledivecentre.com/login/</w:t>
+      </w:r>
+    </w:p>
+    <w:p>
+      <w:pPr>
+        <w:pStyle w:val="ListBullet"/>
+      </w:pPr>
+      <w:r>
+        <w:rPr>
+          <w:b/>
+        </w:rPr>
+        <w:t>Register member public:</w:t>
+      </w:r>
+      <w:r>
+        <w:t xml:space="preserve"> https://whaledivecentre.com/register/</w:t>
+      </w:r>
+    </w:p>
+    <w:p>
+      <w:pPr>
+        <w:pStyle w:val="ListBullet"/>
+      </w:pPr>
+      <w:r>
+        <w:rPr>
+          <w:b/>
+        </w:rPr>
+        <w:t>Courses public:</w:t>
+      </w:r>
+      <w:r>
+        <w:t xml:space="preserve"> https://whaledivecentre.com/courses/</w:t>
+      </w:r>
+    </w:p>
+    <w:p>
+      <w:pPr>
+        <w:pStyle w:val="ListBullet"/>
+      </w:pPr>
+      <w:r>
+        <w:rPr>
+          <w:b/>
+        </w:rPr>
+        <w:t>Equipment public:</w:t>
+      </w:r>
+      <w:r>
+        <w:t xml:space="preserve"> https://whaledivecentre.com/equipment/</w:t>
+      </w:r>
+    </w:p>
+    <w:p>
+      <w:pPr>
+        <w:pStyle w:val="ListBullet"/>
+      </w:pPr>
+      <w:r>
+        <w:rPr>
+          <w:b/>
+        </w:rPr>
+        <w:t>Contact public:</w:t>
+      </w:r>
+      <w:r>
+        <w:t xml:space="preserve"> https://whaledivecentre.com/contact/</w:t>
+      </w:r>
+    </w:p>
+    <w:p>
+      <w:pPr>
+        <w:pStyle w:val="ListBullet"/>
+      </w:pPr>
+      <w:r>
+        <w:rPr>
+          <w:b/>
+        </w:rPr>
+        <w:t>Cek Ongkir giveaway:</w:t>
+      </w:r>
+      <w:r>
+        <w:t xml:space="preserve"> https://berdu.id/cek-ongkir</w:t>
+      </w:r>
+    </w:p>
+    <w:p>
+      <w:pPr>
+        <w:pStyle w:val="ListBullet"/>
+      </w:pPr>
+      <w:r>
+        <w:rPr>
+          <w:b/>
+        </w:rPr>
+        <w:t>Cek Resi giveaway:</w:t>
+      </w:r>
+      <w:r>
+        <w:t xml:space="preserve"> https://cekresi.com/</w:t>
+      </w:r>
+    </w:p>
+    <w:p>
+      <w:pPr>
+        <w:pStyle w:val="Heading1"/>
+      </w:pPr>
+      <w:r>
         <w:t>Tips cepat</w:t>
       </w:r>
     </w:p>
@@ -2181,11 +1353,6 @@
         <w:pStyle w:val="ListBullet"/>
       </w:pPr>
       <w:r>
-        <w:rPr>
-          <w:rFonts w:ascii="Calibri" w:hAnsi="Calibri" w:eastAsia="Calibri"/>
-          <w:b w:val="0"/>
-          <w:sz w:val="22"/>
-        </w:rPr>
         <w:t>Courses &amp; Equipment = data katalog (harga, foto, deskripsi).</w:t>
       </w:r>
     </w:p>
@@ -2194,12 +1361,25 @@
         <w:pStyle w:val="ListBullet"/>
       </w:pPr>
       <w:r>
+        <w:t xml:space="preserve">WDC Site = teks section homepage/about/contact/CTA/crew/testimoni + </w:t>
+      </w:r>
+      <w:r>
         <w:rPr>
-          <w:rFonts w:ascii="Calibri" w:hAnsi="Calibri" w:eastAsia="Calibri"/>
-          <w:b w:val="0"/>
-          <w:sz w:val="22"/>
+          <w:b/>
         </w:rPr>
-        <w:t>WDC Site = teks section homepage/about/contact/CTA/crew/testimoni.</w:t>
+        <w:t>Menus/Links</w:t>
+      </w:r>
+      <w:r>
+        <w:t xml:space="preserve"> + </w:t>
+      </w:r>
+      <w:r>
+        <w:rPr>
+          <w:b/>
+        </w:rPr>
+        <w:t>Partners</w:t>
+      </w:r>
+      <w:r>
+        <w:t>.</w:t>
       </w:r>
     </w:p>
     <w:p>
@@ -2207,11 +1387,6 @@
         <w:pStyle w:val="ListBullet"/>
       </w:pPr>
       <w:r>
-        <w:rPr>
-          <w:rFonts w:ascii="Calibri" w:hAnsi="Calibri" w:eastAsia="Calibri"/>
-          <w:b w:val="0"/>
-          <w:sz w:val="22"/>
-        </w:rPr>
         <w:t>WDC Members = request member + giveaway + rekening TF.</w:t>
       </w:r>
     </w:p>
@@ -2220,11 +1395,6 @@
         <w:pStyle w:val="ListBullet"/>
       </w:pPr>
       <w:r>
-        <w:rPr>
-          <w:rFonts w:ascii="Calibri" w:hAnsi="Calibri" w:eastAsia="Calibri"/>
-          <w:b w:val="0"/>
-          <w:sz w:val="22"/>
-        </w:rPr>
         <w:t>Harga publik; tombol Daftar/Beli butuh login member.</w:t>
       </w:r>
     </w:p>
@@ -2233,11 +1403,6 @@
         <w:pStyle w:val="ListBullet"/>
       </w:pPr>
       <w:r>
-        <w:rPr>
-          <w:rFonts w:ascii="Calibri" w:hAnsi="Calibri" w:eastAsia="Calibri"/>
-          <w:b w:val="0"/>
-          <w:sz w:val="22"/>
-        </w:rPr>
         <w:t>Centang “Show in catalog” supaya item muncul di /courses/ atau /equipment/.</w:t>
       </w:r>
     </w:p>
@@ -2246,12 +1411,7 @@
         <w:pStyle w:val="ListBullet"/>
       </w:pPr>
       <w:r>
-        <w:rPr>
-          <w:rFonts w:ascii="Calibri" w:hAnsi="Calibri" w:eastAsia="Calibri"/>
-          <w:b w:val="0"/>
-          <w:sz w:val="22"/>
-        </w:rPr>
-        <w:t>Featured Image penting untuk card catalog; kosong = fallback tema.</w:t>
+        <w:t>Featured Image penting untuk card catalog.</w:t>
       </w:r>
     </w:p>
     <w:p>
@@ -2259,12 +1419,7 @@
         <w:pStyle w:val="ListBullet"/>
       </w:pPr>
       <w:r>
-        <w:rPr>
-          <w:rFonts w:ascii="Calibri" w:hAnsi="Calibri" w:eastAsia="Calibri"/>
-          <w:b w:val="0"/>
-          <w:sz w:val="22"/>
-        </w:rPr>
-        <w:t>EN di frontend = chrome UI (/en/). Isi artikel/course body tidak auto-translate.</w:t>
+        <w:t>Partner logo: pilih dari Media, jangan ketik file theme.</w:t>
       </w:r>
     </w:p>
     <w:p>
@@ -2272,31 +1427,57 @@
         <w:pStyle w:val="ListBullet"/>
       </w:pPr>
       <w:r>
+        <w:t xml:space="preserve">Navbar/footer links: edit di Menus / Links, format </w:t>
+      </w:r>
+      <w:r>
         <w:rPr>
-          <w:rFonts w:ascii="Calibri" w:hAnsi="Calibri" w:eastAsia="Calibri"/>
-          <w:b w:val="0"/>
-          <w:sz w:val="22"/>
+          <w:rFonts w:ascii="Consolas" w:hAnsi="Consolas"/>
+          <w:sz w:val="18"/>
         </w:rPr>
+        <w:t>Label|URL</w:t>
+      </w:r>
+      <w:r>
+        <w:t>.</w:t>
+      </w:r>
+    </w:p>
+    <w:p>
+      <w:pPr>
+        <w:pStyle w:val="ListBullet"/>
+      </w:pPr>
+      <w:r>
+        <w:t>EN di frontend = chrome UI (</w:t>
+      </w:r>
+      <w:r>
+        <w:rPr>
+          <w:rFonts w:ascii="Consolas" w:hAnsi="Consolas"/>
+          <w:sz w:val="18"/>
+        </w:rPr>
+        <w:t>/en/</w:t>
+      </w:r>
+      <w:r>
+        <w:t>). Isi artikel/course body tidak auto-translate.</w:t>
+      </w:r>
+    </w:p>
+    <w:p>
+      <w:pPr>
+        <w:pStyle w:val="ListBullet"/>
+      </w:pPr>
+      <w:r>
         <w:t>Kalau tampilan belum berubah: Ctrl+F5 dulu.</w:t>
       </w:r>
     </w:p>
     <w:p>
-      <w:pPr>
-        <w:jc w:val="center"/>
-      </w:pPr>
       <w:r>
         <w:rPr>
-          <w:rFonts w:ascii="Calibri" w:hAnsi="Calibri" w:eastAsia="Calibri"/>
-          <w:b w:val="0"/>
-          <w:color w:val="828C96"/>
+          <w:i/>
           <w:sz w:val="18"/>
         </w:rPr>
-        <w:t>Dokumen simple lengkap · client / crew ops</w:t>
+        <w:t>Versi simple lengkap untuk client / crew ops · update 12 July 2026</w:t>
       </w:r>
     </w:p>
     <w:sectPr>
       <w:pgSz w:w="12240" w:h="15840"/>
-      <w:pgMar w:top="864" w:right="936" w:bottom="864" w:left="936" w:header="720" w:footer="720" w:gutter="0"/>
+      <w:pgMar w:top="1008" w:right="1152" w:bottom="1008" w:left="1152" w:header="720" w:footer="720" w:gutter="0"/>
       <w:cols w:space="720"/>
       <w:docGrid w:linePitch="360"/>
     </w:sectPr>
@@ -2667,6 +1848,10 @@
     <w:name w:val="Normal"/>
     <w:qFormat/>
     <w:rsid w:val="00FC693F"/>
+    <w:rPr>
+      <w:rFonts w:ascii="Calibri" w:hAnsi="Calibri" w:eastAsia="Calibri"/>
+      <w:sz w:val="22"/>
+    </w:rPr>
   </w:style>
   <w:style w:type="paragraph" w:styleId="Header">
     <w:name w:val="header"/>
@@ -2727,10 +1912,10 @@
       <w:outlineLvl w:val="0"/>
     </w:pPr>
     <w:rPr>
-      <w:rFonts w:asciiTheme="majorHAnsi" w:eastAsiaTheme="majorEastAsia" w:hAnsiTheme="majorHAnsi" w:cstheme="majorBidi"/>
+      <w:rFonts w:asciiTheme="majorHAnsi" w:eastAsiaTheme="majorEastAsia" w:hAnsiTheme="majorHAnsi" w:cstheme="majorBidi" w:ascii="Calibri" w:hAnsi="Calibri"/>
       <w:b/>
       <w:bCs/>
-      <w:color w:val="365F91" w:themeColor="accent1" w:themeShade="BF"/>
+      <w:color w:val="004A98"/>
       <w:sz w:val="28"/>
       <w:szCs w:val="28"/>
     </w:rPr>
@@ -2751,10 +1936,10 @@
       <w:outlineLvl w:val="1"/>
     </w:pPr>
     <w:rPr>
-      <w:rFonts w:asciiTheme="majorHAnsi" w:eastAsiaTheme="majorEastAsia" w:hAnsiTheme="majorHAnsi" w:cstheme="majorBidi"/>
+      <w:rFonts w:asciiTheme="majorHAnsi" w:eastAsiaTheme="majorEastAsia" w:hAnsiTheme="majorHAnsi" w:cstheme="majorBidi" w:ascii="Calibri" w:hAnsi="Calibri"/>
       <w:b/>
       <w:bCs/>
-      <w:color w:val="4F81BD" w:themeColor="accent1"/>
+      <w:color w:val="004A98"/>
       <w:sz w:val="26"/>
       <w:szCs w:val="26"/>
     </w:rPr>
@@ -2775,10 +1960,10 @@
       <w:outlineLvl w:val="2"/>
     </w:pPr>
     <w:rPr>
-      <w:rFonts w:asciiTheme="majorHAnsi" w:eastAsiaTheme="majorEastAsia" w:hAnsiTheme="majorHAnsi" w:cstheme="majorBidi"/>
+      <w:rFonts w:asciiTheme="majorHAnsi" w:eastAsiaTheme="majorEastAsia" w:hAnsiTheme="majorHAnsi" w:cstheme="majorBidi" w:ascii="Calibri" w:hAnsi="Calibri"/>
       <w:b/>
       <w:bCs/>
-      <w:color w:val="4F81BD" w:themeColor="accent1"/>
+      <w:color w:val="004A98"/>
     </w:rPr>
   </w:style>
   <w:style w:type="paragraph" w:styleId="Heading4">

</xml_diff>